<commit_message>
docs: refresh owner execution-plan doc + add generator; CLAUDE.md owner-instruction rule
- Regenerate docs/execution-plan-next-steps.docx to reflect current state:
  LLC registered (Tier 1 done), Google Workspace live (eric@/greg@), Meta
  access in hand (CAPI step now actionable), GL insurance in progress (LSA
  still gated). Adds a "Where you stand today" section and per-step status flags.
- Add scripts/build-execution-plan-doc.py so the doc is repeatably regenerable
  (the original was built ad-hoc with no committed generator).
- CLAUDE.md: add "Owner-facing instructions" rules — verify it can't be done
  in-session, give the simplest path, true step-by-step, non-technical language,
  grounded in current documentation.
- TASKS_FOR_ERIC.md: update the printable-version pointer note.

Co-Authored-By: Claude Opus 4.8 <noreply@anthropic.com>
Claude-Session: https://claude.ai/code/session_01KT3avfgawXRE34ENi9agBa
</commit_message>
<xml_diff>
--- a/docs/execution-plan-next-steps.docx
+++ b/docs/execution-plan-next-steps.docx
@@ -3,12 +3,10 @@
 <w:document xmlns:wpc="http://schemas.microsoft.com/office/word/2010/wordprocessingCanvas" xmlns:mo="http://schemas.microsoft.com/office/mac/office/2008/main" xmlns:mc="http://schemas.openxmlformats.org/markup-compatibility/2006" xmlns:mv="urn:schemas-microsoft-com:mac:vml" xmlns:o="urn:schemas-microsoft-com:office:office" xmlns:r="http://schemas.openxmlformats.org/officeDocument/2006/relationships" xmlns:m="http://schemas.openxmlformats.org/officeDocument/2006/math" xmlns:v="urn:schemas-microsoft-com:vml" xmlns:wp14="http://schemas.microsoft.com/office/word/2010/wordprocessingDrawing" xmlns:wp="http://schemas.openxmlformats.org/drawingml/2006/wordprocessingDrawing" xmlns:w10="urn:schemas-microsoft-com:office:word" xmlns:w="http://schemas.openxmlformats.org/wordprocessingml/2006/main" xmlns:w14="http://schemas.microsoft.com/office/word/2010/wordml" xmlns:wpg="http://schemas.microsoft.com/office/word/2010/wordprocessingGroup" xmlns:wpi="http://schemas.microsoft.com/office/word/2010/wordprocessingInk" xmlns:wne="http://schemas.microsoft.com/office/word/2006/wordml" xmlns:wps="http://schemas.microsoft.com/office/word/2010/wordprocessingShape" mc:Ignorable="w14 wp14">
   <w:body>
     <w:p>
-      <w:pPr>
-        <w:jc w:val="center"/>
-      </w:pPr>
       <w:r>
         <w:rPr>
           <w:b/>
+          <w:i w:val="0"/>
           <w:color w:val="1B2A4A"/>
           <w:sz w:val="52"/>
         </w:rPr>
@@ -16,12 +14,10 @@
       </w:r>
     </w:p>
     <w:p>
-      <w:pPr>
-        <w:jc w:val="center"/>
-      </w:pPr>
       <w:r>
         <w:rPr>
           <w:b/>
+          <w:i w:val="0"/>
           <w:color w:val="9A5F0F"/>
           <w:sz w:val="30"/>
         </w:rPr>
@@ -29,28 +25,15 @@
       </w:r>
     </w:p>
     <w:p>
-      <w:pPr>
-        <w:jc w:val="center"/>
-      </w:pPr>
       <w:r>
         <w:rPr>
+          <w:b w:val="0"/>
+          <w:i w:val="0"/>
           <w:color w:val="555555"/>
           <w:sz w:val="20"/>
         </w:rPr>
-        <w:t>Immediate priorities (Tier 0–2) · Revenue-ASAP window · Prepared 2026-07-04</w:t>
+        <w:t>Immediate priorities (Tier 0–2) · Revenue-ASAP window · Prepared 2026-07-04 · Revised after LLC + Google Workspace + Meta access</w:t>
       </w:r>
-    </w:p>
-    <w:p>
-      <w:pPr>
-        <w:pBdr>
-          <w:bottom w:val="single" w:sz="6" w:space="1" w:color="C9A227"/>
-        </w:pBdr>
-      </w:pPr>
-    </w:p>
-    <w:p>
-      <w:pPr>
-        <w:spacing w:after="120"/>
-      </w:pPr>
     </w:p>
     <w:p>
       <w:pPr>
@@ -62,22 +45,45 @@
     </w:p>
     <w:p>
       <w:r>
-        <w:t xml:space="preserve">The website and the entire lead pipeline (web form + tracked-call intake → CRM contact + deal + instant alert) are already built and tested. They sit dormant, waiting on the account setups below. </w:t>
+        <w:t>The website and the entire lead pipeline (web form + tracked-call intake → CRM contact + deal + instant alert) are already built and tested. They sit dormant, waiting on the account setups below. Most of these steps live outside the code — in Google, HighLevel, Meta, Vercel, and your state filing. Once you paste each key into Vercel, the matching feature switches on at the next deploy.</w:t>
+      </w:r>
+    </w:p>
+    <w:p>
+      <w:r>
+        <w:rPr>
+          <w:b/>
+          <w:i w:val="0"/>
+        </w:rPr>
+        <w:t xml:space="preserve">The one big idea. </w:t>
       </w:r>
       <w:r>
         <w:rPr>
+          <w:b w:val="0"/>
+          <w:i w:val="0"/>
+        </w:rPr>
+        <w:t>The website is a 6–12 month SEO asset — it will not ring the phone this quarter. What produces near-term revenue is the Tier 0 block: Google Business Profile + Local Services Ads + review velocity + sub-5-minute lead response. Do Tier 0 first, even before the SEO pages matter.</w:t>
+      </w:r>
+    </w:p>
+    <w:p>
+      <w:r>
+        <w:rPr>
           <w:b/>
+          <w:i w:val="0"/>
         </w:rPr>
-        <w:t>Most of these steps live outside the code</w:t>
+        <w:t xml:space="preserve">Pasting a key into Vercel (you'll do this a lot). </w:t>
       </w:r>
       <w:r>
-        <w:t xml:space="preserve"> — in Google, HighLevel, Vercel, and your state filing. Once you paste each key into Vercel, the matching feature switches on at the next deploy.</w:t>
+        <w:rPr>
+          <w:b w:val="0"/>
+          <w:i w:val="0"/>
+        </w:rPr>
+        <w:t>Go to Vercel → your project → Settings → Environment Variables → add the name and value (set it for Production and Preview) → Save. Vercel redeploys automatically. That's the whole loop every time you see a VAR_NAME below.</w:t>
       </w:r>
     </w:p>
     <w:tbl>
       <w:tblPr>
+        <w:tblStyle w:val="TableGrid"/>
         <w:tblW w:type="auto" w:w="0"/>
-        <w:jc w:val="center"/>
         <w:tblLook w:firstColumn="1" w:firstRow="1" w:lastColumn="0" w:lastRow="0" w:noHBand="0" w:noVBand="1" w:val="04A0"/>
       </w:tblPr>
       <w:tblGrid>
@@ -93,14 +99,15 @@
             <w:r>
               <w:rPr>
                 <w:b/>
-                <w:color w:val="9A5F0F"/>
-                <w:sz w:val="20"/>
+                <w:i w:val="0"/>
+                <w:color w:val="1B2A4A"/>
               </w:rPr>
               <w:t xml:space="preserve">Ground rules:  </w:t>
             </w:r>
             <w:r>
               <w:rPr>
-                <w:sz w:val="20"/>
+                <w:b w:val="0"/>
+                <w:i w:val="0"/>
               </w:rPr>
               <w:t>Claude never touches secrets, billing, DNS, or auth. Anything involving those is on this list because it is your action. Never fabricate reviews, addresses, or stats — real data only.</w:t>
             </w:r>
@@ -108,41 +115,55 @@
         </w:tc>
       </w:tr>
     </w:tbl>
+    <w:p/>
     <w:p>
       <w:pPr>
-        <w:spacing w:after="120"/>
+        <w:pStyle w:val="Heading2"/>
       </w:pPr>
-    </w:p>
-    <w:p>
       <w:r>
-        <w:rPr>
-          <w:b/>
-        </w:rPr>
-        <w:t xml:space="preserve">The one big idea. </w:t>
-      </w:r>
-      <w:r>
-        <w:t>The website is a 6–12 month SEO asset — it will not ring the phone this quarter. What produces near-term revenue is the Tier 0 block: Google Business Profile + Local Services Ads + review velocity + sub-5-minute lead response. Do Tier 0 first, even before the SEO pages matter.</w:t>
+        <w:t>Where you stand today</w:t>
       </w:r>
     </w:p>
     <w:p>
       <w:r>
-        <w:rPr>
-          <w:b/>
-        </w:rPr>
-        <w:t xml:space="preserve">Pasting a key into Vercel (you'll do this a lot). </w:t>
+        <w:t>Progress since the first version of this plan:</w:t>
       </w:r>
+    </w:p>
+    <w:p>
+      <w:pPr>
+        <w:pStyle w:val="ListBullet"/>
+      </w:pPr>
       <w:r>
-        <w:t xml:space="preserve">Go to Vercel → your project → Settings → Environment Variables → add the name and value (set it for Production and Preview) → Save. Vercel redeploys automatically. That's the whole loop every time you see a </w:t>
+        <w:t>✓ LLC registered — Northvale Roofing LLC is filed. This unblocks the LSA application, insurance, the trademark filing, and the mailing address for legal pages.</w:t>
       </w:r>
+    </w:p>
+    <w:p>
+      <w:pPr>
+        <w:pStyle w:val="ListBullet"/>
+      </w:pPr>
       <w:r>
-        <w:rPr>
-          <w:rFonts w:ascii="Consolas" w:hAnsi="Consolas"/>
-          <w:b/>
-        </w:rPr>
-        <w:t>VAR_NAME</w:t>
+        <w:t>✓ Business email live — Google Workspace with eric@northvaleroofing.com and greg@northvaleroofing.com. (One small follow-up below: a shared hello@ alias + confirming the SPF/DKIM/DMARC records.)</w:t>
       </w:r>
+    </w:p>
+    <w:p>
+      <w:pPr>
+        <w:pStyle w:val="ListBullet"/>
+      </w:pPr>
       <w:r>
-        <w:t xml:space="preserve"> below.</w:t>
+        <w:t>✓ Meta Business access — you now have the account, so the Conversions API step (Tier 2, Step 5) is actionable today instead of blocked.</w:t>
+      </w:r>
+    </w:p>
+    <w:p>
+      <w:pPr>
+        <w:pStyle w:val="ListBullet"/>
+      </w:pPr>
+      <w:r>
+        <w:t>⏳ General-liability insurance — in progress (a few weeks out). This gates exactly ONE thing: the Local Services Ads application (Tier 0, Step 2). Everything else below can be done now.</w:t>
+      </w:r>
+    </w:p>
+    <w:p>
+      <w:r>
+        <w:t>Do-today shortlist (none of these need insurance): start GBP verification (Tier 0, Step 1); stand up HighLevel + the two speed-to-lead workflows (Tier 0, Step 3 / Tier 2, Step 1); turn on lead alerts + Blob storage (Tier 2, Step 0); wire GA4 (Tier 2, Step 3); issue the Meta Pixel + CAPI token (Tier 2, Step 5); and set PUBLIC_SITE_URL in Vercel (Tier 1, Step 3). Then hand the facts list back to Claude to publish the gated pages.</w:t>
       </w:r>
     </w:p>
     <w:p>
@@ -155,7 +176,7 @@
     </w:p>
     <w:tbl>
       <w:tblPr>
-        <w:tblStyle w:val="LightGrid-Accent1"/>
+        <w:tblStyle w:val="TableGrid"/>
         <w:tblW w:type="auto" w:w="0"/>
         <w:tblLook w:firstColumn="1" w:firstRow="1" w:lastColumn="0" w:lastRow="0" w:noHBand="0" w:noVBand="1" w:val="04A0"/>
       </w:tblPr>
@@ -168,11 +189,15 @@
         <w:tc>
           <w:tcPr>
             <w:tcW w:type="dxa" w:w="2880"/>
+            <w:shd w:val="clear" w:fill="FBF3E0"/>
           </w:tcPr>
           <w:p>
+            <w:r/>
             <w:r>
               <w:rPr>
                 <w:b/>
+                <w:i w:val="0"/>
+                <w:color w:val="1B2A4A"/>
               </w:rPr>
               <w:t>Tier</w:t>
             </w:r>
@@ -181,11 +206,15 @@
         <w:tc>
           <w:tcPr>
             <w:tcW w:type="dxa" w:w="2880"/>
+            <w:shd w:val="clear" w:fill="FBF3E0"/>
           </w:tcPr>
           <w:p>
+            <w:r/>
             <w:r>
               <w:rPr>
                 <w:b/>
+                <w:i w:val="0"/>
+                <w:color w:val="1B2A4A"/>
               </w:rPr>
               <w:t>What it unlocks</w:t>
             </w:r>
@@ -194,13 +223,17 @@
         <w:tc>
           <w:tcPr>
             <w:tcW w:type="dxa" w:w="2880"/>
+            <w:shd w:val="clear" w:fill="FBF3E0"/>
           </w:tcPr>
           <w:p>
+            <w:r/>
             <w:r>
               <w:rPr>
                 <w:b/>
+                <w:i w:val="0"/>
+                <w:color w:val="1B2A4A"/>
               </w:rPr>
-              <w:t>Blocks / enables</w:t>
+              <w:t>Status / blocks</w:t>
             </w:r>
           </w:p>
         </w:tc>
@@ -211,9 +244,11 @@
             <w:tcW w:type="dxa" w:w="2880"/>
           </w:tcPr>
           <w:p>
+            <w:r/>
             <w:r>
               <w:rPr>
-                <w:b/>
+                <w:b w:val="0"/>
+                <w:i w:val="0"/>
               </w:rPr>
               <w:t>Tier 0</w:t>
             </w:r>
@@ -224,7 +259,12 @@
             <w:tcW w:type="dxa" w:w="2880"/>
           </w:tcPr>
           <w:p>
+            <w:r/>
             <w:r>
+              <w:rPr>
+                <w:b w:val="0"/>
+                <w:i w:val="0"/>
+              </w:rPr>
               <w:t>Phone-ringers &amp; speed-to-lead (GBP, LSA, HighLevel auto-response, reviews)</w:t>
             </w:r>
           </w:p>
@@ -234,8 +274,13 @@
             <w:tcW w:type="dxa" w:w="2880"/>
           </w:tcPr>
           <w:p>
+            <w:r/>
             <w:r>
-              <w:t>Near-term revenue — do first</w:t>
+              <w:rPr>
+                <w:b w:val="0"/>
+                <w:i w:val="0"/>
+              </w:rPr>
+              <w:t>Near-term revenue — do first (LSA waits on insurance)</w:t>
             </w:r>
           </w:p>
         </w:tc>
@@ -246,9 +291,11 @@
             <w:tcW w:type="dxa" w:w="2880"/>
           </w:tcPr>
           <w:p>
+            <w:r/>
             <w:r>
               <w:rPr>
-                <w:b/>
+                <w:b w:val="0"/>
+                <w:i w:val="0"/>
               </w:rPr>
               <w:t>Tier 1</w:t>
             </w:r>
@@ -259,7 +306,12 @@
             <w:tcW w:type="dxa" w:w="2880"/>
           </w:tcPr>
           <w:p>
+            <w:r/>
             <w:r>
+              <w:rPr>
+                <w:b w:val="0"/>
+                <w:i w:val="0"/>
+              </w:rPr>
               <w:t>Foundation to go live (LLC, email, phone number)</w:t>
             </w:r>
           </w:p>
@@ -269,8 +321,13 @@
             <w:tcW w:type="dxa" w:w="2880"/>
           </w:tcPr>
           <w:p>
+            <w:r/>
             <w:r>
-              <w:t>Blocks anything going public</w:t>
+              <w:rPr>
+                <w:b w:val="0"/>
+                <w:i w:val="0"/>
+              </w:rPr>
+              <w:t>LLC ✓ · email ✓ — one Vercel value left</w:t>
             </w:r>
           </w:p>
         </w:tc>
@@ -281,9 +338,11 @@
             <w:tcW w:type="dxa" w:w="2880"/>
           </w:tcPr>
           <w:p>
+            <w:r/>
             <w:r>
               <w:rPr>
-                <w:b/>
+                <w:b w:val="0"/>
+                <w:i w:val="0"/>
               </w:rPr>
               <w:t>Tier 2</w:t>
             </w:r>
@@ -294,7 +353,12 @@
             <w:tcW w:type="dxa" w:w="2880"/>
           </w:tcPr>
           <w:p>
+            <w:r/>
             <w:r>
+              <w:rPr>
+                <w:b w:val="0"/>
+                <w:i w:val="0"/>
+              </w:rPr>
               <w:t>Analytics + CRM wiring (HighLevel, CallRail, GA4, Meta, GBP Place ID)</w:t>
             </w:r>
           </w:p>
@@ -304,23 +368,19 @@
             <w:tcW w:type="dxa" w:w="2880"/>
           </w:tcPr>
           <w:p>
+            <w:r/>
             <w:r>
-              <w:t>Blocks attribution / ROI reporting</w:t>
+              <w:rPr>
+                <w:b w:val="0"/>
+                <w:i w:val="0"/>
+              </w:rPr>
+              <w:t>Blocks attribution / ROI — all actionable now</w:t>
             </w:r>
           </w:p>
         </w:tc>
       </w:tr>
     </w:tbl>
-    <w:p>
-      <w:pPr>
-        <w:spacing w:after="160"/>
-      </w:pPr>
-    </w:p>
-    <w:p>
-      <w:r>
-        <w:br w:type="page"/>
-      </w:r>
-    </w:p>
+    <w:p/>
     <w:p>
       <w:pPr>
         <w:pStyle w:val="Heading1"/>
@@ -331,13 +391,7 @@
     </w:p>
     <w:p>
       <w:r>
-        <w:t xml:space="preserve">Fastest path to a ringing phone. Because both owners are part-time, the automated pieces matter most — a lead can't wait on a busy person. </w:t>
-      </w:r>
-      <w:r>
-        <w:rPr>
-          <w:b/>
-        </w:rPr>
-        <w:t>These must be live before you spend the first ad dollar.</w:t>
+        <w:t>Fastest path to a ringing phone. Because both owners are part-time, the automated pieces matter most — a lead can't wait on a busy person. These must be live before you spend the first ad dollar.</w:t>
       </w:r>
     </w:p>
     <w:p>
@@ -345,7 +399,7 @@
         <w:pStyle w:val="Heading3"/>
       </w:pPr>
       <w:r>
-        <w:t>Step 1 — Claim &amp; verify your Google Business Profile (GBP)</w:t>
+        <w:t>Step 1 — Claim &amp; verify your Google Business Profile (GBP)   ▶ do today</w:t>
       </w:r>
     </w:p>
     <w:p>
@@ -359,10 +413,11 @@
       </w:r>
       <w:r>
         <w:rPr>
+          <w:b w:val="0"/>
           <w:i/>
           <w:color w:val="555555"/>
         </w:rPr>
-        <w:t>The local 3-pack and Local Services Ads sit above organic search. This is the single biggest near-term lever.</w:t>
+        <w:t>The local 3-pack and Local Services Ads sit above organic search. This is the single biggest near-term lever, and verification can take days — start the clock now.</w:t>
       </w:r>
     </w:p>
     <w:p>
@@ -370,7 +425,7 @@
         <w:pStyle w:val="ListNumber"/>
       </w:pPr>
       <w:r>
-        <w:t>Go to business.google.com and sign in with the Google account you'll use for the business (ideally hello@northvaleroofing.com once that exists — see Tier 1).</w:t>
+        <w:t>Go to business.google.com and sign in with a business Google account — eric@northvaleroofing.com works, or create a shared hello@ alias/group so the profile isn't tied to one person.</w:t>
       </w:r>
     </w:p>
     <w:p>
@@ -407,8 +462,8 @@
     </w:p>
     <w:tbl>
       <w:tblPr>
+        <w:tblStyle w:val="TableGrid"/>
         <w:tblW w:type="auto" w:w="0"/>
-        <w:jc w:val="center"/>
         <w:tblLook w:firstColumn="1" w:firstRow="1" w:lastColumn="0" w:lastRow="0" w:noHBand="0" w:noVBand="1" w:val="04A0"/>
       </w:tblPr>
       <w:tblGrid>
@@ -418,20 +473,21 @@
         <w:tc>
           <w:tcPr>
             <w:tcW w:type="dxa" w:w="8640"/>
-            <w:shd w:val="clear" w:fill="EEF2F8"/>
+            <w:shd w:val="clear" w:fill="FBF3E0"/>
           </w:tcPr>
           <w:p>
             <w:r>
               <w:rPr>
                 <w:b/>
+                <w:i w:val="0"/>
                 <w:color w:val="1B2A4A"/>
-                <w:sz w:val="20"/>
               </w:rPr>
               <w:t xml:space="preserve">Note:  </w:t>
             </w:r>
             <w:r>
               <w:rPr>
-                <w:sz w:val="20"/>
+                <w:b w:val="0"/>
+                <w:i w:val="0"/>
               </w:rPr>
               <w:t>You'll also need the numeric Place ID later (Tier 2, Step 7). Grab it once the profile is verified.</w:t>
             </w:r>
@@ -439,20 +495,21 @@
         </w:tc>
       </w:tr>
     </w:tbl>
-    <w:p>
-      <w:pPr>
-        <w:spacing w:after="120"/>
-      </w:pPr>
-    </w:p>
+    <w:p/>
     <w:p>
       <w:r>
         <w:rPr>
           <w:b/>
+          <w:i w:val="0"/>
           <w:color w:val="1E7A3C"/>
         </w:rPr>
         <w:t xml:space="preserve">✓ Done when:  </w:t>
       </w:r>
       <w:r>
+        <w:rPr>
+          <w:b w:val="0"/>
+          <w:i w:val="0"/>
+        </w:rPr>
         <w:t>The profile shows 'Verified' and its URL is pasted into the admin panel.</w:t>
       </w:r>
     </w:p>
@@ -461,7 +518,7 @@
         <w:pStyle w:val="Heading3"/>
       </w:pPr>
       <w:r>
-        <w:t>Step 2 — Apply for Google Local Services Ads (LSA)</w:t>
+        <w:t>Step 2 — Apply for Google Local Services Ads (LSA)   ⏳ waiting on insurance</w:t>
       </w:r>
     </w:p>
     <w:p>
@@ -475,6 +532,7 @@
       </w:r>
       <w:r>
         <w:rPr>
+          <w:b w:val="0"/>
           <w:i/>
           <w:color w:val="555555"/>
         </w:rPr>
@@ -486,7 +544,7 @@
         <w:pStyle w:val="ListNumber"/>
       </w:pPr>
       <w:r>
-        <w:t>Do this the day the LLC and general-liability insurance exist (both are required for the application).</w:t>
+        <w:t>Apply the day your general-liability insurance binds — the LLC is already registered, so insurance is the only remaining prerequisite.</w:t>
       </w:r>
     </w:p>
     <w:p>
@@ -515,8 +573,8 @@
     </w:p>
     <w:tbl>
       <w:tblPr>
+        <w:tblStyle w:val="TableGrid"/>
         <w:tblW w:type="auto" w:w="0"/>
-        <w:jc w:val="center"/>
         <w:tblLook w:firstColumn="1" w:firstRow="1" w:lastColumn="0" w:lastRow="0" w:noHBand="0" w:noVBand="1" w:val="04A0"/>
       </w:tblPr>
       <w:tblGrid>
@@ -526,41 +584,43 @@
         <w:tc>
           <w:tcPr>
             <w:tcW w:type="dxa" w:w="8640"/>
-            <w:shd w:val="clear" w:fill="EEF2F8"/>
+            <w:shd w:val="clear" w:fill="FBF3E0"/>
           </w:tcPr>
           <w:p>
             <w:r>
               <w:rPr>
                 <w:b/>
+                <w:i w:val="0"/>
                 <w:color w:val="1B2A4A"/>
-                <w:sz w:val="20"/>
               </w:rPr>
               <w:t xml:space="preserve">Prerequisite:  </w:t>
             </w:r>
             <w:r>
               <w:rPr>
-                <w:sz w:val="20"/>
+                <w:b w:val="0"/>
+                <w:i w:val="0"/>
               </w:rPr>
-              <w:t>Registered LLC (Tier 1, Step 1) + active general-liability insurance. You can't finish the application without them.</w:t>
+              <w:t>Registered LLC ✓ + active general-liability insurance (in progress). You can't finish the application without the insurance. Tip: check whether the background-check step can be started ahead of the insurance binding so it's not the long pole later.</w:t>
             </w:r>
           </w:p>
         </w:tc>
       </w:tr>
     </w:tbl>
-    <w:p>
-      <w:pPr>
-        <w:spacing w:after="120"/>
-      </w:pPr>
-    </w:p>
+    <w:p/>
     <w:p>
       <w:r>
         <w:rPr>
           <w:b/>
+          <w:i w:val="0"/>
           <w:color w:val="1E7A3C"/>
         </w:rPr>
         <w:t xml:space="preserve">✓ Done when:  </w:t>
       </w:r>
       <w:r>
+        <w:rPr>
+          <w:b w:val="0"/>
+          <w:i w:val="0"/>
+        </w:rPr>
         <w:t>The application is submitted and the background/insurance checks are in progress.</w:t>
       </w:r>
     </w:p>
@@ -569,7 +629,7 @@
         <w:pStyle w:val="Heading3"/>
       </w:pPr>
       <w:r>
-        <w:t>Step 3 — Turn on speed-to-lead in HighLevel</w:t>
+        <w:t>Step 3 — Turn on speed-to-lead in HighLevel   ▶ do today (after Tier 2, Step 1)</w:t>
       </w:r>
     </w:p>
     <w:p>
@@ -583,6 +643,7 @@
       </w:r>
       <w:r>
         <w:rPr>
+          <w:b w:val="0"/>
           <w:i/>
           <w:color w:val="555555"/>
         </w:rPr>
@@ -599,9 +660,6 @@
         <w:pStyle w:val="ListBullet"/>
       </w:pPr>
       <w:r>
-        <w:rPr>
-          <w:b/>
-        </w:rPr>
         <w:t>Workflow 1 — Instant auto-responder SMS (under 60 seconds, every form + call lead):</w:t>
       </w:r>
     </w:p>
@@ -626,9 +684,6 @@
         <w:pStyle w:val="ListBullet"/>
       </w:pPr>
       <w:r>
-        <w:rPr>
-          <w:b/>
-        </w:rPr>
         <w:t>Workflow 2 — Missed-call text-back:</w:t>
       </w:r>
     </w:p>
@@ -658,8 +713,8 @@
     </w:p>
     <w:tbl>
       <w:tblPr>
+        <w:tblStyle w:val="TableGrid"/>
         <w:tblW w:type="auto" w:w="0"/>
-        <w:jc w:val="center"/>
         <w:tblLook w:firstColumn="1" w:firstRow="1" w:lastColumn="0" w:lastRow="0" w:noHBand="0" w:noVBand="1" w:val="04A0"/>
       </w:tblPr>
       <w:tblGrid>
@@ -669,20 +724,21 @@
         <w:tc>
           <w:tcPr>
             <w:tcW w:type="dxa" w:w="8640"/>
-            <w:shd w:val="clear" w:fill="EEF2F8"/>
+            <w:shd w:val="clear" w:fill="FBF3E0"/>
           </w:tcPr>
           <w:p>
             <w:r>
               <w:rPr>
                 <w:b/>
+                <w:i w:val="0"/>
                 <w:color w:val="1B2A4A"/>
-                <w:sz w:val="20"/>
               </w:rPr>
               <w:t xml:space="preserve">TCPA:  </w:t>
             </w:r>
             <w:r>
               <w:rPr>
-                <w:sz w:val="20"/>
+                <w:b w:val="0"/>
+                <w:i w:val="0"/>
               </w:rPr>
               <w:t>The website already captures consent + timestamp + IP on every form lead, so automated SMS to a consenting lead is compliant. Keep a 'Reply STOP' opt-out in every message. Full spec: docs/runbooks/speed-to-lead.md.</w:t>
             </w:r>
@@ -690,20 +746,21 @@
         </w:tc>
       </w:tr>
     </w:tbl>
-    <w:p>
-      <w:pPr>
-        <w:spacing w:after="120"/>
-      </w:pPr>
-    </w:p>
+    <w:p/>
     <w:p>
       <w:r>
         <w:rPr>
           <w:b/>
+          <w:i w:val="0"/>
           <w:color w:val="1E7A3C"/>
         </w:rPr>
         <w:t xml:space="preserve">✓ Done when:  </w:t>
       </w:r>
       <w:r>
+        <w:rPr>
+          <w:b w:val="0"/>
+          <w:i w:val="0"/>
+        </w:rPr>
         <w:t>A test form lead triggers the auto-responder in under 60s, and a test ring-out triggers the missed-call text-back — both with a working opt-out.</w:t>
       </w:r>
     </w:p>
@@ -726,6 +783,7 @@
       </w:r>
       <w:r>
         <w:rPr>
+          <w:b w:val="0"/>
           <w:i/>
           <w:color w:val="555555"/>
         </w:rPr>
@@ -758,8 +816,8 @@
     </w:p>
     <w:tbl>
       <w:tblPr>
+        <w:tblStyle w:val="TableGrid"/>
         <w:tblW w:type="auto" w:w="0"/>
-        <w:jc w:val="center"/>
         <w:tblLook w:firstColumn="1" w:firstRow="1" w:lastColumn="0" w:lastRow="0" w:noHBand="0" w:noVBand="1" w:val="04A0"/>
       </w:tblPr>
       <w:tblGrid>
@@ -775,14 +833,15 @@
             <w:r>
               <w:rPr>
                 <w:b/>
-                <w:color w:val="9A5F0F"/>
-                <w:sz w:val="20"/>
+                <w:i w:val="0"/>
+                <w:color w:val="1B2A4A"/>
               </w:rPr>
               <w:t xml:space="preserve">Hard line:  </w:t>
             </w:r>
             <w:r>
               <w:rPr>
-                <w:sz w:val="20"/>
+                <w:b w:val="0"/>
+                <w:i w:val="0"/>
               </w:rPr>
               <w:t>Real reviews only. Never write, buy, or incentivize reviews, and ask ALL completed customers, not just the happy ones — fabricating or gating reviews violates the FTC 2024 rule and Google policy. Full SOP: docs/sops/review-request.md.</w:t>
             </w:r>
@@ -790,20 +849,21 @@
         </w:tc>
       </w:tr>
     </w:tbl>
-    <w:p>
-      <w:pPr>
-        <w:spacing w:after="120"/>
-      </w:pPr>
-    </w:p>
+    <w:p/>
     <w:p>
       <w:r>
         <w:rPr>
           <w:b/>
+          <w:i w:val="0"/>
           <w:color w:val="1E7A3C"/>
         </w:rPr>
         <w:t xml:space="preserve">✓ Done when:  </w:t>
       </w:r>
       <w:r>
+        <w:rPr>
+          <w:b w:val="0"/>
+          <w:i w:val="0"/>
+        </w:rPr>
         <w:t>The review ask is part of your job-close routine and the first genuine reviews are landing on the profile.</w:t>
       </w:r>
     </w:p>
@@ -826,6 +886,7 @@
       </w:r>
       <w:r>
         <w:rPr>
+          <w:b w:val="0"/>
           <w:i/>
           <w:color w:val="555555"/>
         </w:rPr>
@@ -837,13 +898,7 @@
         <w:pStyle w:val="ListBullet"/>
       </w:pPr>
       <w:r>
-        <w:rPr>
-          <w:b/>
-        </w:rPr>
-        <w:t xml:space="preserve">Qualification fields: </w:t>
-      </w:r>
-      <w:r>
-        <w:t>capture retail vs. insurance-claim, roof age, and timeline (emergency / weeks / just researching) so leads branch into the right nurture track.</w:t>
+        <w:t>Qualification fields: capture retail vs. insurance-claim, roof age, and timeline (emergency / weeks / just researching) so leads branch into the right nurture track.</w:t>
       </w:r>
     </w:p>
     <w:p>
@@ -851,13 +906,7 @@
         <w:pStyle w:val="ListBullet"/>
       </w:pPr>
       <w:r>
-        <w:rPr>
-          <w:b/>
-        </w:rPr>
-        <w:t xml:space="preserve">No-answer cadence: </w:t>
-      </w:r>
-      <w:r>
-        <w:t>attempt contact, then automated SMS/email nudges; after 3 no-answers, drop into a 90-day monthly nurture rather than marking the lead dead.</w:t>
+        <w:t>No-answer cadence: attempt contact, then automated SMS/email nudges; after 3 no-answers, drop into a 90-day monthly nurture rather than marking the lead dead.</w:t>
       </w:r>
     </w:p>
     <w:p>
@@ -865,30 +914,24 @@
         <w:pStyle w:val="ListBullet"/>
       </w:pPr>
       <w:r>
-        <w:rPr>
-          <w:b/>
-        </w:rPr>
-        <w:t xml:space="preserve">Quote-follow-up sequence: </w:t>
-      </w:r>
-      <w:r>
-        <w:t>after an estimate is sent, a timed sequence (day 1, 3, 7, 14) — this directly recovers the post-estimate-silence losses.</w:t>
+        <w:t>Quote-follow-up sequence: after an estimate is sent, a timed sequence (day 1, 3, 7, 14) — this directly recovers the post-estimate-silence losses.</w:t>
       </w:r>
     </w:p>
     <w:p>
       <w:r>
         <w:rPr>
           <w:b/>
+          <w:i w:val="0"/>
           <w:color w:val="1E7A3C"/>
         </w:rPr>
         <w:t xml:space="preserve">✓ Done when:  </w:t>
       </w:r>
       <w:r>
+        <w:rPr>
+          <w:b w:val="0"/>
+          <w:i w:val="0"/>
+        </w:rPr>
         <w:t>Insurance-claim leads, retail leads, and 'just researching' leads each land in a distinct nurture track, and no lead can silently die.</w:t>
-      </w:r>
-    </w:p>
-    <w:p>
-      <w:r>
-        <w:br w:type="page"/>
       </w:r>
     </w:p>
     <w:p>
@@ -901,7 +944,7 @@
     </w:p>
     <w:p>
       <w:r>
-        <w:t>These block anything going public. Two are already done (kept here so the picture is complete).</w:t>
+        <w:t>These block anything going public. Most are now done (kept here so the picture is complete).</w:t>
       </w:r>
     </w:p>
     <w:p>
@@ -909,7 +952,146 @@
         <w:pStyle w:val="Heading3"/>
       </w:pPr>
       <w:r>
-        <w:t>Step 1 — Register 'Northvale Roofing LLC'</w:t>
+        <w:t>Step 1 — Register 'Northvale Roofing LLC'   ✓ done</w:t>
+      </w:r>
+    </w:p>
+    <w:p>
+      <w:r>
+        <w:t>The LLC is registered. One follow-up: once the registered-agent / mailing address is final, hand it to the next Claude session so it can fill emailFooterAddress in the legal constants (CAN-SPAM requires a physical address in marketing email) and complete the address in the schema.</w:t>
+      </w:r>
+    </w:p>
+    <w:p>
+      <w:r>
+        <w:rPr>
+          <w:b/>
+          <w:i w:val="0"/>
+          <w:color w:val="1E7A3C"/>
+        </w:rPr>
+        <w:t xml:space="preserve">✓ Done when:  </w:t>
+      </w:r>
+      <w:r>
+        <w:rPr>
+          <w:b w:val="0"/>
+          <w:i w:val="0"/>
+        </w:rPr>
+        <w:t>The LLC is registered ✓ — remaining: hand the mailing address to Claude.</w:t>
+      </w:r>
+    </w:p>
+    <w:p>
+      <w:pPr>
+        <w:pStyle w:val="Heading3"/>
+      </w:pPr>
+      <w:r>
+        <w:t>Step 2 — Domain   ✓ done</w:t>
+      </w:r>
+    </w:p>
+    <w:p>
+      <w:r>
+        <w:t>northvaleroofing.com is registered at Squarespace Domains (2026-04-23), DNS managed there. No action needed unless DNS records change.</w:t>
+      </w:r>
+    </w:p>
+    <w:p>
+      <w:pPr>
+        <w:pStyle w:val="Heading3"/>
+      </w:pPr>
+      <w:r>
+        <w:t>Step 3 — Vercel project   ▶ one value to set today</w:t>
+      </w:r>
+    </w:p>
+    <w:p>
+      <w:r>
+        <w:t>The project exists and preview builds auto-deploy on every push. Remaining action:</w:t>
+      </w:r>
+    </w:p>
+    <w:p>
+      <w:r>
+        <w:rPr>
+          <w:rFonts w:ascii="Consolas" w:hAnsi="Consolas"/>
+          <w:b/>
+          <w:i w:val="0"/>
+          <w:color w:val="9A5F0F"/>
+          <w:sz w:val="20"/>
+        </w:rPr>
+        <w:t>PUBLIC_SITE_URL</w:t>
+      </w:r>
+      <w:r>
+        <w:rPr>
+          <w:b w:val="0"/>
+          <w:i w:val="0"/>
+          <w:sz w:val="20"/>
+        </w:rPr>
+        <w:t xml:space="preserve">  — set to https://northvaleroofing.com in Vercel env once you're ready to point at the real domain.</w:t>
+      </w:r>
+    </w:p>
+    <w:p>
+      <w:r>
+        <w:rPr>
+          <w:b/>
+          <w:i w:val="0"/>
+          <w:color w:val="1E7A3C"/>
+        </w:rPr>
+        <w:t xml:space="preserve">✓ Done when:  </w:t>
+      </w:r>
+      <w:r>
+        <w:rPr>
+          <w:b w:val="0"/>
+          <w:i w:val="0"/>
+        </w:rPr>
+        <w:t>PUBLIC_SITE_URL is set to the apex domain in Vercel.</w:t>
+      </w:r>
+    </w:p>
+    <w:p>
+      <w:pPr>
+        <w:pStyle w:val="Heading3"/>
+      </w:pPr>
+      <w:r>
+        <w:t>Step 4 — Business email   ✓ done (small follow-ups)</w:t>
+      </w:r>
+    </w:p>
+    <w:p>
+      <w:r>
+        <w:t>Google Workspace is live with eric@northvaleroofing.com and greg@northvaleroofing.com. Two quick follow-ups:</w:t>
+      </w:r>
+    </w:p>
+    <w:p>
+      <w:pPr>
+        <w:pStyle w:val="ListNumber"/>
+      </w:pPr>
+      <w:r>
+        <w:t>Add a shared hello@northvaleroofing.com alias or group for public-facing use (GBP, LSA, lead alerts) so the brand isn't tied to one person's inbox.</w:t>
+      </w:r>
+    </w:p>
+    <w:p>
+      <w:pPr>
+        <w:pStyle w:val="ListNumber"/>
+      </w:pPr>
+      <w:r>
+        <w:t>Confirm the MX + SPF, DKIM, and DMARC records validate in Squarespace's DNS manager, so marketing email lands and stays CAN-SPAM compliant. (DNS is your action — Claude will not touch it.)</w:t>
+      </w:r>
+    </w:p>
+    <w:p>
+      <w:r>
+        <w:rPr>
+          <w:b/>
+          <w:i w:val="0"/>
+          <w:color w:val="1E7A3C"/>
+        </w:rPr>
+        <w:t xml:space="preserve">✓ Done when:  </w:t>
+      </w:r>
+      <w:r>
+        <w:rPr>
+          <w:b w:val="0"/>
+          <w:i w:val="0"/>
+        </w:rPr>
+        <w:t>A shared hello@ address exists and SPF/DKIM/DMARC validate.</w:t>
+      </w:r>
+    </w:p>
+    <w:p>
+      <w:pPr>
+        <w:pStyle w:val="Heading3"/>
+      </w:pPr>
+      <w:r>
+        <w:t>Step 5 — Dedicated business phone number   (optional — a line already works)</w:t>
       </w:r>
     </w:p>
     <w:p>
@@ -923,10 +1105,16 @@
       </w:r>
       <w:r>
         <w:rPr>
+          <w:b w:val="0"/>
           <w:i/>
           <w:color w:val="555555"/>
         </w:rPr>
-        <w:t>Everything legal, the LSA application, and insurance all hang off the registered entity. It also gates the trademark filing.</w:t>
+        <w:t>A single, consistent number is the backbone of NAP consistency, GBP, and call tracking.</w:t>
+      </w:r>
+    </w:p>
+    <w:p>
+      <w:r>
+        <w:t>The real business phone (713) 449-7661 is already live in the site data and satisfies the NAP index gate. This step is only about a tracked/dedicated line if you choose a separate one.</w:t>
       </w:r>
     </w:p>
     <w:p>
@@ -934,35 +1122,37 @@
         <w:pStyle w:val="ListNumber"/>
       </w:pPr>
       <w:r>
-        <w:t>File with the Texas Secretary of State (roughly $300, 3–5 business days).</w:t>
-      </w:r>
-    </w:p>
-    <w:p>
-      <w:pPr>
-        <w:pStyle w:val="ListNumber"/>
-      </w:pPr>
-      <w:r>
-        <w:t>We recommend LLC-first — see docs/trademark-clearance.md for the reasoning.</w:t>
-      </w:r>
-    </w:p>
-    <w:p>
-      <w:pPr>
-        <w:pStyle w:val="ListNumber"/>
-      </w:pPr>
-      <w:r>
-        <w:t>Once the registered-agent address is final, hand it to the next Claude session so it can fill emailFooterAddress in the legal constants (CAN-SPAM requires a physical address in marketing email).</w:t>
+        <w:t>If you provision a dedicated number (Twilio or Google Voice Business), hand it to the next Claude session to update BRAND.phoneE164 + phoneDisplay in src/lib/brand.ts — never hardcode it elsewhere.</w:t>
       </w:r>
     </w:p>
     <w:p>
       <w:r>
         <w:rPr>
           <w:b/>
+          <w:i w:val="0"/>
           <w:color w:val="1E7A3C"/>
         </w:rPr>
         <w:t xml:space="preserve">✓ Done when:  </w:t>
       </w:r>
       <w:r>
-        <w:t>The LLC is registered and you have the entity name + address on file.</w:t>
+        <w:rPr>
+          <w:b w:val="0"/>
+          <w:i w:val="0"/>
+        </w:rPr>
+        <w:t>The number is chosen and reflected in brand.ts everywhere the site shows a phone.</w:t>
+      </w:r>
+    </w:p>
+    <w:p>
+      <w:pPr>
+        <w:pStyle w:val="Heading1"/>
+      </w:pPr>
+      <w:r>
+        <w:t>Tier 2 — Analytics + CRM wiring</w:t>
+      </w:r>
+    </w:p>
+    <w:p>
+      <w:r>
+        <w:t>These unlock attribution and ROI reporting. Every one is env-gated: paste the key into Vercel and the feature turns on — no key means a clean skip, nothing breaks. All of Tier 2 is actionable today.</w:t>
       </w:r>
     </w:p>
     <w:p>
@@ -970,65 +1160,7 @@
         <w:pStyle w:val="Heading3"/>
       </w:pPr>
       <w:r>
-        <w:t>Step 2 — Domain (already done ✓)</w:t>
-      </w:r>
-    </w:p>
-    <w:p>
-      <w:r>
-        <w:t>northvaleroofing.com is registered at Squarespace Domains (2026-04-23), DNS managed there. No action needed unless DNS records change.</w:t>
-      </w:r>
-    </w:p>
-    <w:p>
-      <w:pPr>
-        <w:pStyle w:val="Heading3"/>
-      </w:pPr>
-      <w:r>
-        <w:t>Step 3 — Vercel project (created ✓ — one value still to set)</w:t>
-      </w:r>
-    </w:p>
-    <w:p>
-      <w:r>
-        <w:t xml:space="preserve">The project exists and preview builds auto-deploy on every push. Remaining action: </w:t>
-      </w:r>
-    </w:p>
-    <w:p>
-      <w:pPr>
-        <w:ind w:left="360"/>
-      </w:pPr>
-      <w:r>
-        <w:rPr>
-          <w:rFonts w:ascii="Consolas" w:hAnsi="Consolas"/>
-          <w:b/>
-          <w:color w:val="9A5F0F"/>
-          <w:sz w:val="20"/>
-        </w:rPr>
-        <w:t>PUBLIC_SITE_URL</w:t>
-      </w:r>
-      <w:r>
-        <w:rPr>
-          <w:sz w:val="20"/>
-        </w:rPr>
-        <w:t xml:space="preserve">  — set to https://northvaleroofing.com in Vercel env once you're ready to point at the real domain.</w:t>
-      </w:r>
-    </w:p>
-    <w:p>
-      <w:r>
-        <w:rPr>
-          <w:b/>
-          <w:color w:val="1E7A3C"/>
-        </w:rPr>
-        <w:t xml:space="preserve">✓ Done when:  </w:t>
-      </w:r>
-      <w:r>
-        <w:t>PUBLIC_SITE_URL is set to the apex domain in Vercel.</w:t>
-      </w:r>
-    </w:p>
-    <w:p>
-      <w:pPr>
-        <w:pStyle w:val="Heading3"/>
-      </w:pPr>
-      <w:r>
-        <w:t>Step 4 — Set up business email</w:t>
+        <w:t>Step 0 — Day-one lead alerts + never-lose-a-lead storage   ▶ do today (quick win)</w:t>
       </w:r>
     </w:p>
     <w:p>
@@ -1042,169 +1174,7 @@
       </w:r>
       <w:r>
         <w:rPr>
-          <w:i/>
-          <w:color w:val="555555"/>
-        </w:rPr>
-        <w:t>You need hello@northvaleroofing.com for GBP, LSA, lead alerts, and general trust. Deliverability depends on the DNS auth records.</w:t>
-      </w:r>
-    </w:p>
-    <w:p>
-      <w:pPr>
-        <w:pStyle w:val="ListNumber"/>
-      </w:pPr>
-      <w:r>
-        <w:t>Set up Google Workspace (or at minimum a hello@northvaleroofing.com mailbox).</w:t>
-      </w:r>
-    </w:p>
-    <w:p>
-      <w:pPr>
-        <w:pStyle w:val="ListNumber"/>
-      </w:pPr>
-      <w:r>
-        <w:t>Add the MX records, plus SPF, DKIM, and DMARC records, in Squarespace's DNS manager. (DNS is your action — Claude will not touch it.)</w:t>
-      </w:r>
-    </w:p>
-    <w:p>
-      <w:r>
-        <w:rPr>
-          <w:b/>
-          <w:color w:val="1E7A3C"/>
-        </w:rPr>
-        <w:t xml:space="preserve">✓ Done when:  </w:t>
-      </w:r>
-      <w:r>
-        <w:t>hello@northvaleroofing.com sends and receives, and SPF/DKIM/DMARC validate.</w:t>
-      </w:r>
-    </w:p>
-    <w:p>
-      <w:pPr>
-        <w:pStyle w:val="Heading3"/>
-      </w:pPr>
-      <w:r>
-        <w:t>Step 5 — Create a dedicated business phone number</w:t>
-      </w:r>
-    </w:p>
-    <w:p>
-      <w:r>
-        <w:rPr>
-          <w:b/>
-          <w:i/>
-          <w:color w:val="555555"/>
-        </w:rPr>
-        <w:t xml:space="preserve">Why it matters.  </w:t>
-      </w:r>
-      <w:r>
-        <w:rPr>
-          <w:i/>
-          <w:color w:val="555555"/>
-        </w:rPr>
-        <w:t>A single, consistent number is the backbone of NAP consistency, GBP, and call tracking.</w:t>
-      </w:r>
-    </w:p>
-    <w:p>
-      <w:pPr>
-        <w:pStyle w:val="ListNumber"/>
-      </w:pPr>
-      <w:r>
-        <w:t>Provision a dedicated number (Twilio or Google Voice Business).</w:t>
-      </w:r>
-    </w:p>
-    <w:p>
-      <w:pPr>
-        <w:pStyle w:val="ListNumber"/>
-      </w:pPr>
-      <w:r>
-        <w:t>Hand the number to the next Claude session to update BRAND.phoneE164 + phoneDisplay in src/lib/brand.ts — never hardcode it elsewhere.</w:t>
-      </w:r>
-    </w:p>
-    <w:tbl>
-      <w:tblPr>
-        <w:tblW w:type="auto" w:w="0"/>
-        <w:jc w:val="center"/>
-        <w:tblLook w:firstColumn="1" w:firstRow="1" w:lastColumn="0" w:lastRow="0" w:noHBand="0" w:noVBand="1" w:val="04A0"/>
-      </w:tblPr>
-      <w:tblGrid>
-        <w:gridCol w:w="8640"/>
-      </w:tblGrid>
-      <w:tr>
-        <w:tc>
-          <w:tcPr>
-            <w:tcW w:type="dxa" w:w="8640"/>
-            <w:shd w:val="clear" w:fill="EEF2F8"/>
-          </w:tcPr>
-          <w:p>
-            <w:r>
-              <w:rPr>
-                <w:b/>
-                <w:color w:val="1B2A4A"/>
-                <w:sz w:val="20"/>
-              </w:rPr>
-              <w:t xml:space="preserve">Note:  </w:t>
-            </w:r>
-            <w:r>
-              <w:rPr>
-                <w:sz w:val="20"/>
-              </w:rPr>
-              <w:t>The real business phone (713) 449-7661 is already live in the site data and satisfies the NAP index gate. This step is about the tracked/dedicated line if you choose a separate one.</w:t>
-            </w:r>
-          </w:p>
-        </w:tc>
-      </w:tr>
-    </w:tbl>
-    <w:p>
-      <w:pPr>
-        <w:spacing w:after="120"/>
-      </w:pPr>
-    </w:p>
-    <w:p>
-      <w:r>
-        <w:rPr>
-          <w:b/>
-          <w:color w:val="1E7A3C"/>
-        </w:rPr>
-        <w:t xml:space="preserve">✓ Done when:  </w:t>
-      </w:r>
-      <w:r>
-        <w:t>The number is chosen and reflected in brand.ts everywhere the site shows a phone.</w:t>
-      </w:r>
-    </w:p>
-    <w:p>
-      <w:r>
-        <w:br w:type="page"/>
-      </w:r>
-    </w:p>
-    <w:p>
-      <w:pPr>
-        <w:pStyle w:val="Heading1"/>
-      </w:pPr>
-      <w:r>
-        <w:t>Tier 2 — Analytics + CRM wiring</w:t>
-      </w:r>
-    </w:p>
-    <w:p>
-      <w:r>
-        <w:t>These unlock attribution and ROI reporting. Every one is env-gated: paste the key into Vercel and the feature turns on — no key means a clean skip, nothing breaks.</w:t>
-      </w:r>
-    </w:p>
-    <w:p>
-      <w:pPr>
-        <w:pStyle w:val="Heading3"/>
-      </w:pPr>
-      <w:r>
-        <w:t>Step 0 — Day-one lead alerts + never-lose-a-lead storage (quick win)</w:t>
-      </w:r>
-    </w:p>
-    <w:p>
-      <w:r>
-        <w:rPr>
-          <w:b/>
-          <w:i/>
-          <w:color w:val="555555"/>
-        </w:rPr>
-        <w:t xml:space="preserve">Why it matters.  </w:t>
-      </w:r>
-      <w:r>
-        <w:rPr>
+          <w:b w:val="0"/>
           <w:i/>
           <w:color w:val="555555"/>
         </w:rPr>
@@ -1215,18 +1185,17 @@
       <w:r>
         <w:rPr>
           <w:b/>
+          <w:i w:val="0"/>
         </w:rPr>
-        <w:t xml:space="preserve">Text alerts (Twilio, ~$1/mo + ~1¢/text): </w:t>
+        <w:t>Text alerts (Twilio, ~$1/mo + ~1¢/text):</w:t>
       </w:r>
     </w:p>
     <w:p>
-      <w:pPr>
-        <w:ind w:left="360"/>
-      </w:pPr>
       <w:r>
         <w:rPr>
           <w:rFonts w:ascii="Consolas" w:hAnsi="Consolas"/>
           <w:b/>
+          <w:i w:val="0"/>
           <w:color w:val="9A5F0F"/>
           <w:sz w:val="20"/>
         </w:rPr>
@@ -1234,19 +1203,19 @@
       </w:r>
       <w:r>
         <w:rPr>
+          <w:b w:val="0"/>
+          <w:i w:val="0"/>
           <w:sz w:val="20"/>
         </w:rPr>
         <w:t xml:space="preserve">  — Account SID (starts AC…)</w:t>
       </w:r>
     </w:p>
     <w:p>
-      <w:pPr>
-        <w:ind w:left="360"/>
-      </w:pPr>
       <w:r>
         <w:rPr>
           <w:rFonts w:ascii="Consolas" w:hAnsi="Consolas"/>
           <w:b/>
+          <w:i w:val="0"/>
           <w:color w:val="9A5F0F"/>
           <w:sz w:val="20"/>
         </w:rPr>
@@ -1254,19 +1223,19 @@
       </w:r>
       <w:r>
         <w:rPr>
+          <w:b w:val="0"/>
+          <w:i w:val="0"/>
           <w:sz w:val="20"/>
         </w:rPr>
         <w:t xml:space="preserve">  — Auth Token</w:t>
       </w:r>
     </w:p>
     <w:p>
-      <w:pPr>
-        <w:ind w:left="360"/>
-      </w:pPr>
       <w:r>
         <w:rPr>
           <w:rFonts w:ascii="Consolas" w:hAnsi="Consolas"/>
           <w:b/>
+          <w:i w:val="0"/>
           <w:color w:val="9A5F0F"/>
           <w:sz w:val="20"/>
         </w:rPr>
@@ -1274,19 +1243,19 @@
       </w:r>
       <w:r>
         <w:rPr>
+          <w:b w:val="0"/>
+          <w:i w:val="0"/>
           <w:sz w:val="20"/>
         </w:rPr>
         <w:t xml:space="preserve">  — the Twilio number you buy, in +1… format</w:t>
       </w:r>
     </w:p>
     <w:p>
-      <w:pPr>
-        <w:ind w:left="360"/>
-      </w:pPr>
       <w:r>
         <w:rPr>
           <w:rFonts w:ascii="Consolas" w:hAnsi="Consolas"/>
           <w:b/>
+          <w:i w:val="0"/>
           <w:color w:val="9A5F0F"/>
           <w:sz w:val="20"/>
         </w:rPr>
@@ -1294,6 +1263,8 @@
       </w:r>
       <w:r>
         <w:rPr>
+          <w:b w:val="0"/>
+          <w:i w:val="0"/>
           <w:sz w:val="20"/>
         </w:rPr>
         <w:t xml:space="preserve">  — owner cell(s), comma-separated E.164, e.g. +12815550111,+18325550222</w:t>
@@ -1303,18 +1274,17 @@
       <w:r>
         <w:rPr>
           <w:b/>
+          <w:i w:val="0"/>
         </w:rPr>
-        <w:t xml:space="preserve">Email alerts (Resend, free to start): </w:t>
+        <w:t>Email alerts (Resend, free to start):</w:t>
       </w:r>
     </w:p>
     <w:p>
-      <w:pPr>
-        <w:ind w:left="360"/>
-      </w:pPr>
       <w:r>
         <w:rPr>
           <w:rFonts w:ascii="Consolas" w:hAnsi="Consolas"/>
           <w:b/>
+          <w:i w:val="0"/>
           <w:color w:val="9A5F0F"/>
           <w:sz w:val="20"/>
         </w:rPr>
@@ -1322,19 +1292,19 @@
       </w:r>
       <w:r>
         <w:rPr>
+          <w:b w:val="0"/>
+          <w:i w:val="0"/>
           <w:sz w:val="20"/>
         </w:rPr>
         <w:t xml:space="preserve">  — the key (starts re_…)</w:t>
       </w:r>
     </w:p>
     <w:p>
-      <w:pPr>
-        <w:ind w:left="360"/>
-      </w:pPr>
       <w:r>
         <w:rPr>
           <w:rFonts w:ascii="Consolas" w:hAnsi="Consolas"/>
           <w:b/>
+          <w:i w:val="0"/>
           <w:color w:val="9A5F0F"/>
           <w:sz w:val="20"/>
         </w:rPr>
@@ -1342,19 +1312,19 @@
       </w:r>
       <w:r>
         <w:rPr>
+          <w:b w:val="0"/>
+          <w:i w:val="0"/>
           <w:sz w:val="20"/>
         </w:rPr>
-        <w:t xml:space="preserve">  — owner email(s), comma-separated</w:t>
+        <w:t xml:space="preserve">  — owner email(s), comma-separated — e.g. eric@ + greg@northvaleroofing.com</w:t>
       </w:r>
     </w:p>
     <w:p>
-      <w:pPr>
-        <w:ind w:left="360"/>
-      </w:pPr>
       <w:r>
         <w:rPr>
           <w:rFonts w:ascii="Consolas" w:hAnsi="Consolas"/>
           <w:b/>
+          <w:i w:val="0"/>
           <w:color w:val="9A5F0F"/>
           <w:sz w:val="20"/>
         </w:rPr>
@@ -1362,6 +1332,8 @@
       </w:r>
       <w:r>
         <w:rPr>
+          <w:b w:val="0"/>
+          <w:i w:val="0"/>
           <w:sz w:val="20"/>
         </w:rPr>
         <w:t xml:space="preserve">  — leads@resend.dev to start, or a verified domain sender</w:t>
@@ -1371,8 +1343,9 @@
       <w:r>
         <w:rPr>
           <w:b/>
+          <w:i w:val="0"/>
         </w:rPr>
-        <w:t xml:space="preserve">Never-lose-a-lead storage (Vercel Blob, ~2 min): </w:t>
+        <w:t>Never-lose-a-lead storage (Vercel Blob, ~2 min):</w:t>
       </w:r>
     </w:p>
     <w:p>
@@ -1393,8 +1366,8 @@
     </w:p>
     <w:tbl>
       <w:tblPr>
+        <w:tblStyle w:val="TableGrid"/>
         <w:tblW w:type="auto" w:w="0"/>
-        <w:jc w:val="center"/>
         <w:tblLook w:firstColumn="1" w:firstRow="1" w:lastColumn="0" w:lastRow="0" w:noHBand="0" w:noVBand="1" w:val="04A0"/>
       </w:tblPr>
       <w:tblGrid>
@@ -1404,20 +1377,21 @@
         <w:tc>
           <w:tcPr>
             <w:tcW w:type="dxa" w:w="8640"/>
-            <w:shd w:val="clear" w:fill="EEF2F8"/>
+            <w:shd w:val="clear" w:fill="FBF3E0"/>
           </w:tcPr>
           <w:p>
             <w:r>
               <w:rPr>
                 <w:b/>
+                <w:i w:val="0"/>
                 <w:color w:val="1B2A4A"/>
-                <w:sz w:val="20"/>
               </w:rPr>
               <w:t xml:space="preserve">Note:  </w:t>
             </w:r>
             <w:r>
               <w:rPr>
-                <w:sz w:val="20"/>
+                <w:b w:val="0"/>
+                <w:i w:val="0"/>
               </w:rPr>
               <w:t>Full walkthrough: docs/setup-leads.md. Each channel turns on independently when its keys are present.</w:t>
             </w:r>
@@ -1425,20 +1399,21 @@
         </w:tc>
       </w:tr>
     </w:tbl>
-    <w:p>
-      <w:pPr>
-        <w:spacing w:after="120"/>
-      </w:pPr>
-    </w:p>
+    <w:p/>
     <w:p>
       <w:r>
         <w:rPr>
           <w:b/>
+          <w:i w:val="0"/>
           <w:color w:val="1E7A3C"/>
         </w:rPr>
         <w:t xml:space="preserve">✓ Done when:  </w:t>
       </w:r>
       <w:r>
+        <w:rPr>
+          <w:b w:val="0"/>
+          <w:i w:val="0"/>
+        </w:rPr>
         <w:t>A test form submission texts and emails you within seconds, and a JSON record appears in the Blob store.</w:t>
       </w:r>
     </w:p>
@@ -1447,7 +1422,7 @@
         <w:pStyle w:val="Heading3"/>
       </w:pPr>
       <w:r>
-        <w:t>Step 1 — HighLevel CRM keys (powers Tier 0 speed-to-lead)</w:t>
+        <w:t>Step 1 — HighLevel CRM keys   ▶ do today (powers Tier 0 speed-to-lead)</w:t>
       </w:r>
     </w:p>
     <w:p>
@@ -1461,6 +1436,7 @@
       </w:r>
       <w:r>
         <w:rPr>
+          <w:b w:val="0"/>
           <w:i/>
           <w:color w:val="555555"/>
         </w:rPr>
@@ -1508,13 +1484,11 @@
       </w:r>
     </w:p>
     <w:p>
-      <w:pPr>
-        <w:ind w:left="360"/>
-      </w:pPr>
       <w:r>
         <w:rPr>
           <w:rFonts w:ascii="Consolas" w:hAnsi="Consolas"/>
           <w:b/>
+          <w:i w:val="0"/>
           <w:color w:val="9A5F0F"/>
           <w:sz w:val="20"/>
         </w:rPr>
@@ -1522,19 +1496,19 @@
       </w:r>
       <w:r>
         <w:rPr>
+          <w:b w:val="0"/>
+          <w:i w:val="0"/>
           <w:sz w:val="20"/>
         </w:rPr>
         <w:t xml:space="preserve">  — the Private Integration token (required)</w:t>
       </w:r>
     </w:p>
     <w:p>
-      <w:pPr>
-        <w:ind w:left="360"/>
-      </w:pPr>
       <w:r>
         <w:rPr>
           <w:rFonts w:ascii="Consolas" w:hAnsi="Consolas"/>
           <w:b/>
+          <w:i w:val="0"/>
           <w:color w:val="9A5F0F"/>
           <w:sz w:val="20"/>
         </w:rPr>
@@ -1542,19 +1516,19 @@
       </w:r>
       <w:r>
         <w:rPr>
+          <w:b w:val="0"/>
+          <w:i w:val="0"/>
           <w:sz w:val="20"/>
         </w:rPr>
         <w:t xml:space="preserve">  — the sub-account/location id (required)</w:t>
       </w:r>
     </w:p>
     <w:p>
-      <w:pPr>
-        <w:ind w:left="360"/>
-      </w:pPr>
       <w:r>
         <w:rPr>
           <w:rFonts w:ascii="Consolas" w:hAnsi="Consolas"/>
           <w:b/>
+          <w:i w:val="0"/>
           <w:color w:val="9A5F0F"/>
           <w:sz w:val="20"/>
         </w:rPr>
@@ -1562,19 +1536,19 @@
       </w:r>
       <w:r>
         <w:rPr>
+          <w:b w:val="0"/>
+          <w:i w:val="0"/>
           <w:sz w:val="20"/>
         </w:rPr>
         <w:t xml:space="preserve">  — optional — set with the stage below to also open a pipeline deal per lead</w:t>
       </w:r>
     </w:p>
     <w:p>
-      <w:pPr>
-        <w:ind w:left="360"/>
-      </w:pPr>
       <w:r>
         <w:rPr>
           <w:rFonts w:ascii="Consolas" w:hAnsi="Consolas"/>
           <w:b/>
+          <w:i w:val="0"/>
           <w:color w:val="9A5F0F"/>
           <w:sz w:val="20"/>
         </w:rPr>
@@ -1582,6 +1556,8 @@
       </w:r>
       <w:r>
         <w:rPr>
+          <w:b w:val="0"/>
+          <w:i w:val="0"/>
           <w:sz w:val="20"/>
         </w:rPr>
         <w:t xml:space="preserve">  — optional — the first / 'New Lead' stage id</w:t>
@@ -1589,8 +1565,8 @@
     </w:p>
     <w:tbl>
       <w:tblPr>
+        <w:tblStyle w:val="TableGrid"/>
         <w:tblW w:type="auto" w:w="0"/>
-        <w:jc w:val="center"/>
         <w:tblLook w:firstColumn="1" w:firstRow="1" w:lastColumn="0" w:lastRow="0" w:noHBand="0" w:noVBand="1" w:val="04A0"/>
       </w:tblPr>
       <w:tblGrid>
@@ -1600,41 +1576,43 @@
         <w:tc>
           <w:tcPr>
             <w:tcW w:type="dxa" w:w="8640"/>
-            <w:shd w:val="clear" w:fill="EEF2F8"/>
+            <w:shd w:val="clear" w:fill="FBF3E0"/>
           </w:tcPr>
           <w:p>
             <w:r>
               <w:rPr>
                 <w:b/>
+                <w:i w:val="0"/>
                 <w:color w:val="1B2A4A"/>
-                <w:sz w:val="20"/>
               </w:rPr>
               <w:t xml:space="preserve">Note:  </w:t>
             </w:r>
             <w:r>
               <w:rPr>
-                <w:sz w:val="20"/>
+                <w:b w:val="0"/>
+                <w:i w:val="0"/>
               </w:rPr>
-              <w:t>First two keys = contacts created. Add the last two = each lead also opens an opportunity. Full guide: docs/setup-highlevel.md.</w:t>
+              <w:t>First two keys = contacts created. Add the last two = each lead also opens an opportunity. Full guide: docs/setup-highlevel.md. After keys land, submit one test lead and confirm the live v2 payload shapes match — they were built to the published docs.</w:t>
             </w:r>
           </w:p>
         </w:tc>
       </w:tr>
     </w:tbl>
-    <w:p>
-      <w:pPr>
-        <w:spacing w:after="120"/>
-      </w:pPr>
-    </w:p>
+    <w:p/>
     <w:p>
       <w:r>
         <w:rPr>
           <w:b/>
+          <w:i w:val="0"/>
           <w:color w:val="1E7A3C"/>
         </w:rPr>
         <w:t xml:space="preserve">✓ Done when:  </w:t>
       </w:r>
       <w:r>
+        <w:rPr>
+          <w:b w:val="0"/>
+          <w:i w:val="0"/>
+        </w:rPr>
         <w:t>A test form submission shows a new contact (and, if configured, a New-Lead opportunity) in HighLevel within seconds, with lead_source populated.</w:t>
       </w:r>
     </w:p>
@@ -1657,6 +1635,7 @@
       </w:r>
       <w:r>
         <w:rPr>
+          <w:b w:val="0"/>
           <w:i/>
           <w:color w:val="555555"/>
         </w:rPr>
@@ -1688,13 +1667,11 @@
       </w:r>
     </w:p>
     <w:p>
-      <w:pPr>
-        <w:ind w:left="360"/>
-      </w:pPr>
       <w:r>
         <w:rPr>
           <w:rFonts w:ascii="Consolas" w:hAnsi="Consolas"/>
           <w:b/>
+          <w:i w:val="0"/>
           <w:color w:val="9A5F0F"/>
           <w:sz w:val="20"/>
         </w:rPr>
@@ -1702,19 +1679,19 @@
       </w:r>
       <w:r>
         <w:rPr>
+          <w:b w:val="0"/>
+          <w:i w:val="0"/>
           <w:sz w:val="20"/>
         </w:rPr>
         <w:t xml:space="preserve">  — the shared secret for webhook signature verification</w:t>
       </w:r>
     </w:p>
     <w:p>
-      <w:pPr>
-        <w:ind w:left="360"/>
-      </w:pPr>
       <w:r>
         <w:rPr>
           <w:rFonts w:ascii="Consolas" w:hAnsi="Consolas"/>
           <w:b/>
+          <w:i w:val="0"/>
           <w:color w:val="9A5F0F"/>
           <w:sz w:val="20"/>
         </w:rPr>
@@ -1722,19 +1699,19 @@
       </w:r>
       <w:r>
         <w:rPr>
+          <w:b w:val="0"/>
+          <w:i w:val="0"/>
           <w:sz w:val="20"/>
         </w:rPr>
         <w:t xml:space="preserve">  — CallRail API v3 key</w:t>
       </w:r>
     </w:p>
     <w:p>
-      <w:pPr>
-        <w:ind w:left="360"/>
-      </w:pPr>
       <w:r>
         <w:rPr>
           <w:rFonts w:ascii="Consolas" w:hAnsi="Consolas"/>
           <w:b/>
+          <w:i w:val="0"/>
           <w:color w:val="9A5F0F"/>
           <w:sz w:val="20"/>
         </w:rPr>
@@ -1742,19 +1719,19 @@
       </w:r>
       <w:r>
         <w:rPr>
+          <w:b w:val="0"/>
+          <w:i w:val="0"/>
           <w:sz w:val="20"/>
         </w:rPr>
         <w:t xml:space="preserve">  — your CallRail account id</w:t>
       </w:r>
     </w:p>
     <w:p>
-      <w:pPr>
-        <w:ind w:left="360"/>
-      </w:pPr>
       <w:r>
         <w:rPr>
           <w:rFonts w:ascii="Consolas" w:hAnsi="Consolas"/>
           <w:b/>
+          <w:i w:val="0"/>
           <w:color w:val="9A5F0F"/>
           <w:sz w:val="20"/>
         </w:rPr>
@@ -1762,6 +1739,8 @@
       </w:r>
       <w:r>
         <w:rPr>
+          <w:b w:val="0"/>
+          <w:i w:val="0"/>
           <w:sz w:val="20"/>
         </w:rPr>
         <w:t xml:space="preserve">  — the companyId/scriptKey segments from the DNI swap.js snippet</w:t>
@@ -1771,11 +1750,16 @@
       <w:r>
         <w:rPr>
           <w:b/>
+          <w:i w:val="0"/>
           <w:color w:val="1E7A3C"/>
         </w:rPr>
         <w:t xml:space="preserve">✓ Done when:  </w:t>
       </w:r>
       <w:r>
+        <w:rPr>
+          <w:b w:val="0"/>
+          <w:i w:val="0"/>
+        </w:rPr>
         <w:t>A completed test call to a tracked number appears as a HighLevel contact and fires the same SMS/email alert as a form lead.</w:t>
       </w:r>
     </w:p>
@@ -1784,7 +1768,7 @@
         <w:pStyle w:val="Heading3"/>
       </w:pPr>
       <w:r>
-        <w:t>Step 3 — Google Analytics 4 (GA4)</w:t>
+        <w:t>Step 3 — Google Analytics 4 (GA4)   ▶ do today</w:t>
       </w:r>
     </w:p>
     <w:p>
@@ -1798,6 +1782,7 @@
       </w:r>
       <w:r>
         <w:rPr>
+          <w:b w:val="0"/>
           <w:i/>
           <w:color w:val="555555"/>
         </w:rPr>
@@ -1821,13 +1806,11 @@
       </w:r>
     </w:p>
     <w:p>
-      <w:pPr>
-        <w:ind w:left="360"/>
-      </w:pPr>
       <w:r>
         <w:rPr>
           <w:rFonts w:ascii="Consolas" w:hAnsi="Consolas"/>
           <w:b/>
+          <w:i w:val="0"/>
           <w:color w:val="9A5F0F"/>
           <w:sz w:val="20"/>
         </w:rPr>
@@ -1835,6 +1818,8 @@
       </w:r>
       <w:r>
         <w:rPr>
+          <w:b w:val="0"/>
+          <w:i w:val="0"/>
           <w:sz w:val="20"/>
         </w:rPr>
         <w:t xml:space="preserve">  — the G-XXXXXXXXXX measurement id</w:t>
@@ -1842,8 +1827,8 @@
     </w:p>
     <w:tbl>
       <w:tblPr>
+        <w:tblStyle w:val="TableGrid"/>
         <w:tblW w:type="auto" w:w="0"/>
-        <w:jc w:val="center"/>
         <w:tblLook w:firstColumn="1" w:firstRow="1" w:lastColumn="0" w:lastRow="0" w:noHBand="0" w:noVBand="1" w:val="04A0"/>
       </w:tblPr>
       <w:tblGrid>
@@ -1853,20 +1838,21 @@
         <w:tc>
           <w:tcPr>
             <w:tcW w:type="dxa" w:w="8640"/>
-            <w:shd w:val="clear" w:fill="EEF2F8"/>
+            <w:shd w:val="clear" w:fill="FBF3E0"/>
           </w:tcPr>
           <w:p>
             <w:r>
               <w:rPr>
                 <w:b/>
+                <w:i w:val="0"/>
                 <w:color w:val="1B2A4A"/>
-                <w:sz w:val="20"/>
               </w:rPr>
-              <w:t xml:space="preserve">Bonus (2 min, no DNS):   </w:t>
+              <w:t xml:space="preserve">Bonus (2 min, no DNS):  </w:t>
             </w:r>
             <w:r>
               <w:rPr>
-                <w:sz w:val="20"/>
+                <w:b w:val="0"/>
+                <w:i w:val="0"/>
               </w:rPr>
               <w:t>Verify Google Search Console via the HTML-tag method — set PUBLIC_GSC_VERIFICATION to the content value Google shows, redeploy, click Verify, then submit https://northvaleroofing.com/sitemap-index.xml. See docs/analytics-search-console.md.</w:t>
             </w:r>
@@ -1874,20 +1860,21 @@
         </w:tc>
       </w:tr>
     </w:tbl>
-    <w:p>
-      <w:pPr>
-        <w:spacing w:after="120"/>
-      </w:pPr>
-    </w:p>
+    <w:p/>
     <w:p>
       <w:r>
         <w:rPr>
           <w:b/>
+          <w:i w:val="0"/>
           <w:color w:val="1E7A3C"/>
         </w:rPr>
         <w:t xml:space="preserve">✓ Done when:  </w:t>
       </w:r>
       <w:r>
+        <w:rPr>
+          <w:b w:val="0"/>
+          <w:i w:val="0"/>
+        </w:rPr>
         <w:t>GA4 Realtime shows your own visit to the live site.</w:t>
       </w:r>
     </w:p>
@@ -1910,6 +1897,7 @@
       </w:r>
       <w:r>
         <w:rPr>
+          <w:b w:val="0"/>
           <w:i/>
           <w:color w:val="555555"/>
         </w:rPr>
@@ -1933,13 +1921,11 @@
       </w:r>
     </w:p>
     <w:p>
-      <w:pPr>
-        <w:ind w:left="360"/>
-      </w:pPr>
       <w:r>
         <w:rPr>
           <w:rFonts w:ascii="Consolas" w:hAnsi="Consolas"/>
           <w:b/>
+          <w:i w:val="0"/>
           <w:color w:val="9A5F0F"/>
           <w:sz w:val="20"/>
         </w:rPr>
@@ -1947,6 +1933,8 @@
       </w:r>
       <w:r>
         <w:rPr>
+          <w:b w:val="0"/>
+          <w:i w:val="0"/>
           <w:sz w:val="20"/>
         </w:rPr>
         <w:t xml:space="preserve">  — the GTM-XXXXXXX container id</w:t>
@@ -1956,11 +1944,16 @@
       <w:r>
         <w:rPr>
           <w:b/>
+          <w:i w:val="0"/>
           <w:color w:val="1E7A3C"/>
         </w:rPr>
         <w:t xml:space="preserve">✓ Done when:  </w:t>
       </w:r>
       <w:r>
+        <w:rPr>
+          <w:b w:val="0"/>
+          <w:i w:val="0"/>
+        </w:rPr>
         <w:t>The GTM container is live and PUBLIC_GTM_ID is set.</w:t>
       </w:r>
     </w:p>
@@ -1969,7 +1962,7 @@
         <w:pStyle w:val="Heading3"/>
       </w:pPr>
       <w:r>
-        <w:t>Step 5 — Meta Business Manager + Conversions API (CAPI)</w:t>
+        <w:t>Step 5 — Meta Business Manager + Conversions API (CAPI)   ▶ do today (you have access)</w:t>
       </w:r>
     </w:p>
     <w:p>
@@ -1983,10 +1976,11 @@
       </w:r>
       <w:r>
         <w:rPr>
+          <w:b w:val="0"/>
           <w:i/>
           <w:color w:val="555555"/>
         </w:rPr>
-        <w:t>Every form lead sends a server-side 'Lead' conversion (hashed PII) to Meta automatically — the code is done and waiting on keys.</w:t>
+        <w:t>Every form lead sends a server-side 'Lead' conversion (hashed PII) to Meta automatically — the code is done and waiting on keys. You now have the Meta account, so this is actionable today.</w:t>
       </w:r>
     </w:p>
     <w:p>
@@ -1994,7 +1988,7 @@
         <w:pStyle w:val="ListNumber"/>
       </w:pPr>
       <w:r>
-        <w:t>Create a Meta ad account and Business Manager.</w:t>
+        <w:t>In your Meta Business account, confirm/create the ad account, then open Events Manager → Data Sources and create a Pixel if one doesn't exist.</w:t>
       </w:r>
     </w:p>
     <w:p>
@@ -2002,7 +1996,7 @@
         <w:pStyle w:val="ListNumber"/>
       </w:pPr>
       <w:r>
-        <w:t>Issue a CAPI access token and note the pixel id.</w:t>
+        <w:t>Copy the numeric Pixel ID, then generate a Conversions API access token (Events Manager → your pixel → Settings → Generate access token).</w:t>
       </w:r>
     </w:p>
     <w:p>
@@ -2014,13 +2008,11 @@
       </w:r>
     </w:p>
     <w:p>
-      <w:pPr>
-        <w:ind w:left="360"/>
-      </w:pPr>
       <w:r>
         <w:rPr>
           <w:rFonts w:ascii="Consolas" w:hAnsi="Consolas"/>
           <w:b/>
+          <w:i w:val="0"/>
           <w:color w:val="9A5F0F"/>
           <w:sz w:val="20"/>
         </w:rPr>
@@ -2028,19 +2020,19 @@
       </w:r>
       <w:r>
         <w:rPr>
+          <w:b w:val="0"/>
+          <w:i w:val="0"/>
           <w:sz w:val="20"/>
         </w:rPr>
         <w:t xml:space="preserve">  — the Conversions API access token (server-side)</w:t>
       </w:r>
     </w:p>
     <w:p>
-      <w:pPr>
-        <w:ind w:left="360"/>
-      </w:pPr>
       <w:r>
         <w:rPr>
           <w:rFonts w:ascii="Consolas" w:hAnsi="Consolas"/>
           <w:b/>
+          <w:i w:val="0"/>
           <w:color w:val="9A5F0F"/>
           <w:sz w:val="20"/>
         </w:rPr>
@@ -2048,20 +2040,63 @@
       </w:r>
       <w:r>
         <w:rPr>
+          <w:b w:val="0"/>
+          <w:i w:val="0"/>
           <w:sz w:val="20"/>
         </w:rPr>
         <w:t xml:space="preserve">  — the pixel id (digits) — also renders the browser pixel</w:t>
       </w:r>
     </w:p>
+    <w:tbl>
+      <w:tblPr>
+        <w:tblStyle w:val="TableGrid"/>
+        <w:tblW w:type="auto" w:w="0"/>
+        <w:tblLook w:firstColumn="1" w:firstRow="1" w:lastColumn="0" w:lastRow="0" w:noHBand="0" w:noVBand="1" w:val="04A0"/>
+      </w:tblPr>
+      <w:tblGrid>
+        <w:gridCol w:w="8640"/>
+      </w:tblGrid>
+      <w:tr>
+        <w:tc>
+          <w:tcPr>
+            <w:tcW w:type="dxa" w:w="8640"/>
+            <w:shd w:val="clear" w:fill="FBF3E0"/>
+          </w:tcPr>
+          <w:p>
+            <w:r>
+              <w:rPr>
+                <w:b/>
+                <w:i w:val="0"/>
+                <w:color w:val="1B2A4A"/>
+              </w:rPr>
+              <w:t xml:space="preserve">Note:  </w:t>
+            </w:r>
+            <w:r>
+              <w:rPr>
+                <w:b w:val="0"/>
+                <w:i w:val="0"/>
+              </w:rPr>
+              <w:t>Hold actual campaigns paused until the CPL signal is real (that's Tier 5). This step is just the account + pixel + token wiring.</w:t>
+            </w:r>
+          </w:p>
+        </w:tc>
+      </w:tr>
+    </w:tbl>
+    <w:p/>
     <w:p>
       <w:r>
         <w:rPr>
           <w:b/>
+          <w:i w:val="0"/>
           <w:color w:val="1E7A3C"/>
         </w:rPr>
         <w:t xml:space="preserve">✓ Done when:  </w:t>
       </w:r>
       <w:r>
+        <w:rPr>
+          <w:b w:val="0"/>
+          <w:i w:val="0"/>
+        </w:rPr>
         <w:t>A test form lead shows a server-side Lead event in Meta Events Manager.</w:t>
       </w:r>
     </w:p>
@@ -2084,6 +2119,7 @@
       </w:r>
       <w:r>
         <w:rPr>
+          <w:b w:val="0"/>
           <w:i/>
           <w:color w:val="555555"/>
         </w:rPr>
@@ -2107,13 +2143,11 @@
       </w:r>
     </w:p>
     <w:p>
-      <w:pPr>
-        <w:ind w:left="360"/>
-      </w:pPr>
       <w:r>
         <w:rPr>
           <w:rFonts w:ascii="Consolas" w:hAnsi="Consolas"/>
           <w:b/>
+          <w:i w:val="0"/>
           <w:color w:val="9A5F0F"/>
           <w:sz w:val="20"/>
         </w:rPr>
@@ -2121,19 +2155,19 @@
       </w:r>
       <w:r>
         <w:rPr>
+          <w:b w:val="0"/>
+          <w:i w:val="0"/>
           <w:sz w:val="20"/>
         </w:rPr>
         <w:t xml:space="preserve">  — AW-XXXXXXXXX</w:t>
       </w:r>
     </w:p>
     <w:p>
-      <w:pPr>
-        <w:ind w:left="360"/>
-      </w:pPr>
       <w:r>
         <w:rPr>
           <w:rFonts w:ascii="Consolas" w:hAnsi="Consolas"/>
           <w:b/>
+          <w:i w:val="0"/>
           <w:color w:val="9A5F0F"/>
           <w:sz w:val="20"/>
         </w:rPr>
@@ -2141,59 +2175,27 @@
       </w:r>
       <w:r>
         <w:rPr>
+          <w:b w:val="0"/>
+          <w:i w:val="0"/>
           <w:sz w:val="20"/>
         </w:rPr>
         <w:t xml:space="preserve">  — the label after the slash — /thank-you fires the conversion only when both are set</w:t>
       </w:r>
     </w:p>
-    <w:tbl>
-      <w:tblPr>
-        <w:tblW w:type="auto" w:w="0"/>
-        <w:jc w:val="center"/>
-        <w:tblLook w:firstColumn="1" w:firstRow="1" w:lastColumn="0" w:lastRow="0" w:noHBand="0" w:noVBand="1" w:val="04A0"/>
-      </w:tblPr>
-      <w:tblGrid>
-        <w:gridCol w:w="8640"/>
-      </w:tblGrid>
-      <w:tr>
-        <w:tc>
-          <w:tcPr>
-            <w:tcW w:type="dxa" w:w="8640"/>
-            <w:shd w:val="clear" w:fill="EEF2F8"/>
-          </w:tcPr>
-          <w:p>
-            <w:r>
-              <w:rPr>
-                <w:b/>
-                <w:color w:val="1B2A4A"/>
-                <w:sz w:val="20"/>
-              </w:rPr>
-              <w:t xml:space="preserve">Note:  </w:t>
-            </w:r>
-            <w:r>
-              <w:rPr>
-                <w:sz w:val="20"/>
-              </w:rPr>
-              <w:t>Hold actual campaigns paused until the CPL signal is real (that's Tier 5). This step is just the account + wiring.</w:t>
-            </w:r>
-          </w:p>
-        </w:tc>
-      </w:tr>
-    </w:tbl>
-    <w:p>
-      <w:pPr>
-        <w:spacing w:after="120"/>
-      </w:pPr>
-    </w:p>
     <w:p>
       <w:r>
         <w:rPr>
           <w:b/>
+          <w:i w:val="0"/>
           <w:color w:val="1E7A3C"/>
         </w:rPr>
         <w:t xml:space="preserve">✓ Done when:  </w:t>
       </w:r>
       <w:r>
+        <w:rPr>
+          <w:b w:val="0"/>
+          <w:i w:val="0"/>
+        </w:rPr>
         <w:t>The account exists and the conversion id/label are set in Vercel.</w:t>
       </w:r>
     </w:p>
@@ -2216,6 +2218,7 @@
       </w:r>
       <w:r>
         <w:rPr>
+          <w:b w:val="0"/>
           <w:i/>
           <w:color w:val="555555"/>
         </w:rPr>
@@ -2239,13 +2242,11 @@
       </w:r>
     </w:p>
     <w:p>
-      <w:pPr>
-        <w:ind w:left="360"/>
-      </w:pPr>
       <w:r>
         <w:rPr>
           <w:rFonts w:ascii="Consolas" w:hAnsi="Consolas"/>
           <w:b/>
+          <w:i w:val="0"/>
           <w:color w:val="9A5F0F"/>
           <w:sz w:val="20"/>
         </w:rPr>
@@ -2253,6 +2254,8 @@
       </w:r>
       <w:r>
         <w:rPr>
+          <w:b w:val="0"/>
+          <w:i w:val="0"/>
           <w:sz w:val="20"/>
         </w:rPr>
         <w:t xml:space="preserve">  — the Northvale Roofing GBP Place ID</w:t>
@@ -2262,11 +2265,16 @@
       <w:r>
         <w:rPr>
           <w:b/>
+          <w:i w:val="0"/>
           <w:color w:val="1E7A3C"/>
         </w:rPr>
         <w:t xml:space="preserve">✓ Done when:  </w:t>
       </w:r>
       <w:r>
+        <w:rPr>
+          <w:b w:val="0"/>
+          <w:i w:val="0"/>
+        </w:rPr>
         <w:t>GOOGLE_PLACE_ID is set in Vercel.</w:t>
       </w:r>
     </w:p>
@@ -2289,6 +2297,7 @@
       </w:r>
       <w:r>
         <w:rPr>
+          <w:b w:val="0"/>
           <w:i/>
           <w:color w:val="555555"/>
         </w:rPr>
@@ -2312,13 +2321,11 @@
       </w:r>
     </w:p>
     <w:p>
-      <w:pPr>
-        <w:ind w:left="360"/>
-      </w:pPr>
       <w:r>
         <w:rPr>
           <w:rFonts w:ascii="Consolas" w:hAnsi="Consolas"/>
           <w:b/>
+          <w:i w:val="0"/>
           <w:color w:val="9A5F0F"/>
           <w:sz w:val="20"/>
         </w:rPr>
@@ -2326,6 +2333,8 @@
       </w:r>
       <w:r>
         <w:rPr>
+          <w:b w:val="0"/>
+          <w:i w:val="0"/>
           <w:sz w:val="20"/>
         </w:rPr>
         <w:t xml:space="preserve">  — scoped for the reviews pull</w:t>
@@ -2335,17 +2344,17 @@
       <w:r>
         <w:rPr>
           <w:b/>
+          <w:i w:val="0"/>
           <w:color w:val="1E7A3C"/>
         </w:rPr>
         <w:t xml:space="preserve">✓ Done when:  </w:t>
       </w:r>
       <w:r>
+        <w:rPr>
+          <w:b w:val="0"/>
+          <w:i w:val="0"/>
+        </w:rPr>
         <w:t>GOOGLE_PLACES_API_KEY is set and /reviews pulls real GBP reviews.</w:t>
-      </w:r>
-    </w:p>
-    <w:p>
-      <w:r>
-        <w:br w:type="page"/>
       </w:r>
     </w:p>
     <w:p>
@@ -2361,13 +2370,7 @@
         <w:pStyle w:val="ListBullet"/>
       </w:pPr>
       <w:r>
-        <w:rPr>
-          <w:b/>
-        </w:rPr>
-        <w:t xml:space="preserve">Keys → Vercel. </w:t>
-      </w:r>
-      <w:r>
-        <w:t>Anything that's a KEY goes into Vercel env (Production + Preview). The feature activates on redeploy. Nothing else needed.</w:t>
+        <w:t>Keys → Vercel. Anything that's a KEY goes into Vercel env (Production + Preview). The feature activates on redeploy. Nothing else needed.</w:t>
       </w:r>
     </w:p>
     <w:p>
@@ -2375,13 +2378,7 @@
         <w:pStyle w:val="ListBullet"/>
       </w:pPr>
       <w:r>
-        <w:rPr>
-          <w:b/>
-        </w:rPr>
-        <w:t xml:space="preserve">Data → admin panel. </w:t>
-      </w:r>
-      <w:r>
-        <w:t>GBP/social URLs, financing terms, team, warranty, and photos go into the /keystatic admin panel — those pages publish themselves once real data is present.</w:t>
+        <w:t>Data → admin panel. GBP/social URLs, financing terms, team, warranty, and photos go into the /keystatic admin panel — those pages publish themselves once real data is present.</w:t>
       </w:r>
     </w:p>
     <w:p>
@@ -2389,13 +2386,7 @@
         <w:pStyle w:val="ListBullet"/>
       </w:pPr>
       <w:r>
-        <w:rPr>
-          <w:b/>
-        </w:rPr>
-        <w:t xml:space="preserve">Facts/decisions → next Claude session. </w:t>
-      </w:r>
-      <w:r>
-        <w:t>Years in market, carriers you've worked, crew model, the LLC's mailing address, and the new phone number — hand these to the next Claude session so it can update the code truthfully. Never invent any of them.</w:t>
+        <w:t>Facts/decisions → next Claude session. The LLC's mailing address, years in market, carriers you've worked, crew model, and any new phone number — hand these to the next Claude session so it can update the code truthfully. Never invent any of them.</w:t>
       </w:r>
     </w:p>
     <w:p>
@@ -2408,33 +2399,16 @@
     </w:p>
     <w:p>
       <w:r>
-        <w:t xml:space="preserve">Once these are live and leads are flowing with attribution, the plan continues into Tier 2.5/2.6 (data that unlocks gated SEO pages + the copy-facts questionnaire), Tier 3 (legal review + real photography, removing demo images), and Tier 5 (paid campaigns + the launch checklist). The full ordered list lives in </w:t>
-      </w:r>
-      <w:r>
-        <w:rPr>
-          <w:rFonts w:ascii="Consolas" w:hAnsi="Consolas"/>
-        </w:rPr>
-        <w:t>TASKS_FOR_ERIC.md</w:t>
-      </w:r>
-      <w:r>
-        <w:t xml:space="preserve"> in the repo. Ask for the next installment of this document when you're ready.</w:t>
+        <w:t>Once these are live and leads are flowing with attribution, the plan continues into Tier 2.5/2.6 (data that unlocks gated SEO pages + the copy-facts questionnaire), Tier 3 (legal review + real photography, removing demo images), and Tier 5 (paid campaigns + the launch checklist). The full ordered list lives in TASKS_FOR_ERIC.md in the repo. Ask for the next installment of this document when you're ready.</w:t>
       </w:r>
     </w:p>
     <w:p>
-      <w:pPr>
-        <w:pBdr>
-          <w:bottom w:val="single" w:sz="6" w:space="1" w:color="C9A227"/>
-        </w:pBdr>
-      </w:pPr>
-    </w:p>
-    <w:p>
-      <w:pPr>
-        <w:jc w:val="center"/>
-      </w:pPr>
       <w:r>
         <w:rPr>
+          <w:b w:val="0"/>
+          <w:i w:val="0"/>
           <w:color w:val="555555"/>
-          <w:sz w:val="18"/>
+          <w:sz w:val="20"/>
         </w:rPr>
         <w:t>Northvale Roofing · Internal execution plan · Not for public distribution</w:t>
       </w:r>
@@ -2812,9 +2786,6 @@
     <w:name w:val="Normal"/>
     <w:qFormat/>
     <w:rsid w:val="00FC693F"/>
-    <w:pPr>
-      <w:spacing w:after="120"/>
-    </w:pPr>
     <w:rPr>
       <w:rFonts w:ascii="Calibri" w:hAnsi="Calibri"/>
       <w:sz w:val="22"/>

</xml_diff>

<commit_message>
docs: refresh owner execution-plan doc + add generator; CLAUDE.md owner-instruction rule (#29)
- Regenerate docs/execution-plan-next-steps.docx to reflect current state:
  LLC registered (Tier 1 done), Google Workspace live (eric@/greg@), Meta
  access in hand (CAPI step now actionable), GL insurance in progress (LSA
  still gated). Adds a "Where you stand today" section and per-step status flags.
- Add scripts/build-execution-plan-doc.py so the doc is repeatably regenerable
  (the original was built ad-hoc with no committed generator).
- CLAUDE.md: add "Owner-facing instructions" rules — verify it can't be done
  in-session, give the simplest path, true step-by-step, non-technical language,
  grounded in current documentation.
- TASKS_FOR_ERIC.md: update the printable-version pointer note.


Claude-Session: https://claude.ai/code/session_01KT3avfgawXRE34ENi9agBa

Co-authored-by: Claude <noreply@anthropic.com>
</commit_message>
<xml_diff>
--- a/docs/execution-plan-next-steps.docx
+++ b/docs/execution-plan-next-steps.docx
@@ -3,12 +3,10 @@
 <w:document xmlns:wpc="http://schemas.microsoft.com/office/word/2010/wordprocessingCanvas" xmlns:mo="http://schemas.microsoft.com/office/mac/office/2008/main" xmlns:mc="http://schemas.openxmlformats.org/markup-compatibility/2006" xmlns:mv="urn:schemas-microsoft-com:mac:vml" xmlns:o="urn:schemas-microsoft-com:office:office" xmlns:r="http://schemas.openxmlformats.org/officeDocument/2006/relationships" xmlns:m="http://schemas.openxmlformats.org/officeDocument/2006/math" xmlns:v="urn:schemas-microsoft-com:vml" xmlns:wp14="http://schemas.microsoft.com/office/word/2010/wordprocessingDrawing" xmlns:wp="http://schemas.openxmlformats.org/drawingml/2006/wordprocessingDrawing" xmlns:w10="urn:schemas-microsoft-com:office:word" xmlns:w="http://schemas.openxmlformats.org/wordprocessingml/2006/main" xmlns:w14="http://schemas.microsoft.com/office/word/2010/wordml" xmlns:wpg="http://schemas.microsoft.com/office/word/2010/wordprocessingGroup" xmlns:wpi="http://schemas.microsoft.com/office/word/2010/wordprocessingInk" xmlns:wne="http://schemas.microsoft.com/office/word/2006/wordml" xmlns:wps="http://schemas.microsoft.com/office/word/2010/wordprocessingShape" mc:Ignorable="w14 wp14">
   <w:body>
     <w:p>
-      <w:pPr>
-        <w:jc w:val="center"/>
-      </w:pPr>
       <w:r>
         <w:rPr>
           <w:b/>
+          <w:i w:val="0"/>
           <w:color w:val="1B2A4A"/>
           <w:sz w:val="52"/>
         </w:rPr>
@@ -16,12 +14,10 @@
       </w:r>
     </w:p>
     <w:p>
-      <w:pPr>
-        <w:jc w:val="center"/>
-      </w:pPr>
       <w:r>
         <w:rPr>
           <w:b/>
+          <w:i w:val="0"/>
           <w:color w:val="9A5F0F"/>
           <w:sz w:val="30"/>
         </w:rPr>
@@ -29,28 +25,15 @@
       </w:r>
     </w:p>
     <w:p>
-      <w:pPr>
-        <w:jc w:val="center"/>
-      </w:pPr>
       <w:r>
         <w:rPr>
+          <w:b w:val="0"/>
+          <w:i w:val="0"/>
           <w:color w:val="555555"/>
           <w:sz w:val="20"/>
         </w:rPr>
-        <w:t>Immediate priorities (Tier 0–2) · Revenue-ASAP window · Prepared 2026-07-04</w:t>
+        <w:t>Immediate priorities (Tier 0–2) · Revenue-ASAP window · Prepared 2026-07-04 · Revised after LLC + Google Workspace + Meta access</w:t>
       </w:r>
-    </w:p>
-    <w:p>
-      <w:pPr>
-        <w:pBdr>
-          <w:bottom w:val="single" w:sz="6" w:space="1" w:color="C9A227"/>
-        </w:pBdr>
-      </w:pPr>
-    </w:p>
-    <w:p>
-      <w:pPr>
-        <w:spacing w:after="120"/>
-      </w:pPr>
     </w:p>
     <w:p>
       <w:pPr>
@@ -62,22 +45,45 @@
     </w:p>
     <w:p>
       <w:r>
-        <w:t xml:space="preserve">The website and the entire lead pipeline (web form + tracked-call intake → CRM contact + deal + instant alert) are already built and tested. They sit dormant, waiting on the account setups below. </w:t>
+        <w:t>The website and the entire lead pipeline (web form + tracked-call intake → CRM contact + deal + instant alert) are already built and tested. They sit dormant, waiting on the account setups below. Most of these steps live outside the code — in Google, HighLevel, Meta, Vercel, and your state filing. Once you paste each key into Vercel, the matching feature switches on at the next deploy.</w:t>
+      </w:r>
+    </w:p>
+    <w:p>
+      <w:r>
+        <w:rPr>
+          <w:b/>
+          <w:i w:val="0"/>
+        </w:rPr>
+        <w:t xml:space="preserve">The one big idea. </w:t>
       </w:r>
       <w:r>
         <w:rPr>
+          <w:b w:val="0"/>
+          <w:i w:val="0"/>
+        </w:rPr>
+        <w:t>The website is a 6–12 month SEO asset — it will not ring the phone this quarter. What produces near-term revenue is the Tier 0 block: Google Business Profile + Local Services Ads + review velocity + sub-5-minute lead response. Do Tier 0 first, even before the SEO pages matter.</w:t>
+      </w:r>
+    </w:p>
+    <w:p>
+      <w:r>
+        <w:rPr>
           <w:b/>
+          <w:i w:val="0"/>
         </w:rPr>
-        <w:t>Most of these steps live outside the code</w:t>
+        <w:t xml:space="preserve">Pasting a key into Vercel (you'll do this a lot). </w:t>
       </w:r>
       <w:r>
-        <w:t xml:space="preserve"> — in Google, HighLevel, Vercel, and your state filing. Once you paste each key into Vercel, the matching feature switches on at the next deploy.</w:t>
+        <w:rPr>
+          <w:b w:val="0"/>
+          <w:i w:val="0"/>
+        </w:rPr>
+        <w:t>Go to Vercel → your project → Settings → Environment Variables → add the name and value (set it for Production and Preview) → Save. Vercel redeploys automatically. That's the whole loop every time you see a VAR_NAME below.</w:t>
       </w:r>
     </w:p>
     <w:tbl>
       <w:tblPr>
+        <w:tblStyle w:val="TableGrid"/>
         <w:tblW w:type="auto" w:w="0"/>
-        <w:jc w:val="center"/>
         <w:tblLook w:firstColumn="1" w:firstRow="1" w:lastColumn="0" w:lastRow="0" w:noHBand="0" w:noVBand="1" w:val="04A0"/>
       </w:tblPr>
       <w:tblGrid>
@@ -93,14 +99,15 @@
             <w:r>
               <w:rPr>
                 <w:b/>
-                <w:color w:val="9A5F0F"/>
-                <w:sz w:val="20"/>
+                <w:i w:val="0"/>
+                <w:color w:val="1B2A4A"/>
               </w:rPr>
               <w:t xml:space="preserve">Ground rules:  </w:t>
             </w:r>
             <w:r>
               <w:rPr>
-                <w:sz w:val="20"/>
+                <w:b w:val="0"/>
+                <w:i w:val="0"/>
               </w:rPr>
               <w:t>Claude never touches secrets, billing, DNS, or auth. Anything involving those is on this list because it is your action. Never fabricate reviews, addresses, or stats — real data only.</w:t>
             </w:r>
@@ -108,41 +115,55 @@
         </w:tc>
       </w:tr>
     </w:tbl>
+    <w:p/>
     <w:p>
       <w:pPr>
-        <w:spacing w:after="120"/>
+        <w:pStyle w:val="Heading2"/>
       </w:pPr>
-    </w:p>
-    <w:p>
       <w:r>
-        <w:rPr>
-          <w:b/>
-        </w:rPr>
-        <w:t xml:space="preserve">The one big idea. </w:t>
-      </w:r>
-      <w:r>
-        <w:t>The website is a 6–12 month SEO asset — it will not ring the phone this quarter. What produces near-term revenue is the Tier 0 block: Google Business Profile + Local Services Ads + review velocity + sub-5-minute lead response. Do Tier 0 first, even before the SEO pages matter.</w:t>
+        <w:t>Where you stand today</w:t>
       </w:r>
     </w:p>
     <w:p>
       <w:r>
-        <w:rPr>
-          <w:b/>
-        </w:rPr>
-        <w:t xml:space="preserve">Pasting a key into Vercel (you'll do this a lot). </w:t>
+        <w:t>Progress since the first version of this plan:</w:t>
       </w:r>
+    </w:p>
+    <w:p>
+      <w:pPr>
+        <w:pStyle w:val="ListBullet"/>
+      </w:pPr>
       <w:r>
-        <w:t xml:space="preserve">Go to Vercel → your project → Settings → Environment Variables → add the name and value (set it for Production and Preview) → Save. Vercel redeploys automatically. That's the whole loop every time you see a </w:t>
+        <w:t>✓ LLC registered — Northvale Roofing LLC is filed. This unblocks the LSA application, insurance, the trademark filing, and the mailing address for legal pages.</w:t>
       </w:r>
+    </w:p>
+    <w:p>
+      <w:pPr>
+        <w:pStyle w:val="ListBullet"/>
+      </w:pPr>
       <w:r>
-        <w:rPr>
-          <w:rFonts w:ascii="Consolas" w:hAnsi="Consolas"/>
-          <w:b/>
-        </w:rPr>
-        <w:t>VAR_NAME</w:t>
+        <w:t>✓ Business email live — Google Workspace with eric@northvaleroofing.com and greg@northvaleroofing.com. (One small follow-up below: a shared hello@ alias + confirming the SPF/DKIM/DMARC records.)</w:t>
       </w:r>
+    </w:p>
+    <w:p>
+      <w:pPr>
+        <w:pStyle w:val="ListBullet"/>
+      </w:pPr>
       <w:r>
-        <w:t xml:space="preserve"> below.</w:t>
+        <w:t>✓ Meta Business access — you now have the account, so the Conversions API step (Tier 2, Step 5) is actionable today instead of blocked.</w:t>
+      </w:r>
+    </w:p>
+    <w:p>
+      <w:pPr>
+        <w:pStyle w:val="ListBullet"/>
+      </w:pPr>
+      <w:r>
+        <w:t>⏳ General-liability insurance — in progress (a few weeks out). This gates exactly ONE thing: the Local Services Ads application (Tier 0, Step 2). Everything else below can be done now.</w:t>
+      </w:r>
+    </w:p>
+    <w:p>
+      <w:r>
+        <w:t>Do-today shortlist (none of these need insurance): start GBP verification (Tier 0, Step 1); stand up HighLevel + the two speed-to-lead workflows (Tier 0, Step 3 / Tier 2, Step 1); turn on lead alerts + Blob storage (Tier 2, Step 0); wire GA4 (Tier 2, Step 3); issue the Meta Pixel + CAPI token (Tier 2, Step 5); and set PUBLIC_SITE_URL in Vercel (Tier 1, Step 3). Then hand the facts list back to Claude to publish the gated pages.</w:t>
       </w:r>
     </w:p>
     <w:p>
@@ -155,7 +176,7 @@
     </w:p>
     <w:tbl>
       <w:tblPr>
-        <w:tblStyle w:val="LightGrid-Accent1"/>
+        <w:tblStyle w:val="TableGrid"/>
         <w:tblW w:type="auto" w:w="0"/>
         <w:tblLook w:firstColumn="1" w:firstRow="1" w:lastColumn="0" w:lastRow="0" w:noHBand="0" w:noVBand="1" w:val="04A0"/>
       </w:tblPr>
@@ -168,11 +189,15 @@
         <w:tc>
           <w:tcPr>
             <w:tcW w:type="dxa" w:w="2880"/>
+            <w:shd w:val="clear" w:fill="FBF3E0"/>
           </w:tcPr>
           <w:p>
+            <w:r/>
             <w:r>
               <w:rPr>
                 <w:b/>
+                <w:i w:val="0"/>
+                <w:color w:val="1B2A4A"/>
               </w:rPr>
               <w:t>Tier</w:t>
             </w:r>
@@ -181,11 +206,15 @@
         <w:tc>
           <w:tcPr>
             <w:tcW w:type="dxa" w:w="2880"/>
+            <w:shd w:val="clear" w:fill="FBF3E0"/>
           </w:tcPr>
           <w:p>
+            <w:r/>
             <w:r>
               <w:rPr>
                 <w:b/>
+                <w:i w:val="0"/>
+                <w:color w:val="1B2A4A"/>
               </w:rPr>
               <w:t>What it unlocks</w:t>
             </w:r>
@@ -194,13 +223,17 @@
         <w:tc>
           <w:tcPr>
             <w:tcW w:type="dxa" w:w="2880"/>
+            <w:shd w:val="clear" w:fill="FBF3E0"/>
           </w:tcPr>
           <w:p>
+            <w:r/>
             <w:r>
               <w:rPr>
                 <w:b/>
+                <w:i w:val="0"/>
+                <w:color w:val="1B2A4A"/>
               </w:rPr>
-              <w:t>Blocks / enables</w:t>
+              <w:t>Status / blocks</w:t>
             </w:r>
           </w:p>
         </w:tc>
@@ -211,9 +244,11 @@
             <w:tcW w:type="dxa" w:w="2880"/>
           </w:tcPr>
           <w:p>
+            <w:r/>
             <w:r>
               <w:rPr>
-                <w:b/>
+                <w:b w:val="0"/>
+                <w:i w:val="0"/>
               </w:rPr>
               <w:t>Tier 0</w:t>
             </w:r>
@@ -224,7 +259,12 @@
             <w:tcW w:type="dxa" w:w="2880"/>
           </w:tcPr>
           <w:p>
+            <w:r/>
             <w:r>
+              <w:rPr>
+                <w:b w:val="0"/>
+                <w:i w:val="0"/>
+              </w:rPr>
               <w:t>Phone-ringers &amp; speed-to-lead (GBP, LSA, HighLevel auto-response, reviews)</w:t>
             </w:r>
           </w:p>
@@ -234,8 +274,13 @@
             <w:tcW w:type="dxa" w:w="2880"/>
           </w:tcPr>
           <w:p>
+            <w:r/>
             <w:r>
-              <w:t>Near-term revenue — do first</w:t>
+              <w:rPr>
+                <w:b w:val="0"/>
+                <w:i w:val="0"/>
+              </w:rPr>
+              <w:t>Near-term revenue — do first (LSA waits on insurance)</w:t>
             </w:r>
           </w:p>
         </w:tc>
@@ -246,9 +291,11 @@
             <w:tcW w:type="dxa" w:w="2880"/>
           </w:tcPr>
           <w:p>
+            <w:r/>
             <w:r>
               <w:rPr>
-                <w:b/>
+                <w:b w:val="0"/>
+                <w:i w:val="0"/>
               </w:rPr>
               <w:t>Tier 1</w:t>
             </w:r>
@@ -259,7 +306,12 @@
             <w:tcW w:type="dxa" w:w="2880"/>
           </w:tcPr>
           <w:p>
+            <w:r/>
             <w:r>
+              <w:rPr>
+                <w:b w:val="0"/>
+                <w:i w:val="0"/>
+              </w:rPr>
               <w:t>Foundation to go live (LLC, email, phone number)</w:t>
             </w:r>
           </w:p>
@@ -269,8 +321,13 @@
             <w:tcW w:type="dxa" w:w="2880"/>
           </w:tcPr>
           <w:p>
+            <w:r/>
             <w:r>
-              <w:t>Blocks anything going public</w:t>
+              <w:rPr>
+                <w:b w:val="0"/>
+                <w:i w:val="0"/>
+              </w:rPr>
+              <w:t>LLC ✓ · email ✓ — one Vercel value left</w:t>
             </w:r>
           </w:p>
         </w:tc>
@@ -281,9 +338,11 @@
             <w:tcW w:type="dxa" w:w="2880"/>
           </w:tcPr>
           <w:p>
+            <w:r/>
             <w:r>
               <w:rPr>
-                <w:b/>
+                <w:b w:val="0"/>
+                <w:i w:val="0"/>
               </w:rPr>
               <w:t>Tier 2</w:t>
             </w:r>
@@ -294,7 +353,12 @@
             <w:tcW w:type="dxa" w:w="2880"/>
           </w:tcPr>
           <w:p>
+            <w:r/>
             <w:r>
+              <w:rPr>
+                <w:b w:val="0"/>
+                <w:i w:val="0"/>
+              </w:rPr>
               <w:t>Analytics + CRM wiring (HighLevel, CallRail, GA4, Meta, GBP Place ID)</w:t>
             </w:r>
           </w:p>
@@ -304,23 +368,19 @@
             <w:tcW w:type="dxa" w:w="2880"/>
           </w:tcPr>
           <w:p>
+            <w:r/>
             <w:r>
-              <w:t>Blocks attribution / ROI reporting</w:t>
+              <w:rPr>
+                <w:b w:val="0"/>
+                <w:i w:val="0"/>
+              </w:rPr>
+              <w:t>Blocks attribution / ROI — all actionable now</w:t>
             </w:r>
           </w:p>
         </w:tc>
       </w:tr>
     </w:tbl>
-    <w:p>
-      <w:pPr>
-        <w:spacing w:after="160"/>
-      </w:pPr>
-    </w:p>
-    <w:p>
-      <w:r>
-        <w:br w:type="page"/>
-      </w:r>
-    </w:p>
+    <w:p/>
     <w:p>
       <w:pPr>
         <w:pStyle w:val="Heading1"/>
@@ -331,13 +391,7 @@
     </w:p>
     <w:p>
       <w:r>
-        <w:t xml:space="preserve">Fastest path to a ringing phone. Because both owners are part-time, the automated pieces matter most — a lead can't wait on a busy person. </w:t>
-      </w:r>
-      <w:r>
-        <w:rPr>
-          <w:b/>
-        </w:rPr>
-        <w:t>These must be live before you spend the first ad dollar.</w:t>
+        <w:t>Fastest path to a ringing phone. Because both owners are part-time, the automated pieces matter most — a lead can't wait on a busy person. These must be live before you spend the first ad dollar.</w:t>
       </w:r>
     </w:p>
     <w:p>
@@ -345,7 +399,7 @@
         <w:pStyle w:val="Heading3"/>
       </w:pPr>
       <w:r>
-        <w:t>Step 1 — Claim &amp; verify your Google Business Profile (GBP)</w:t>
+        <w:t>Step 1 — Claim &amp; verify your Google Business Profile (GBP)   ▶ do today</w:t>
       </w:r>
     </w:p>
     <w:p>
@@ -359,10 +413,11 @@
       </w:r>
       <w:r>
         <w:rPr>
+          <w:b w:val="0"/>
           <w:i/>
           <w:color w:val="555555"/>
         </w:rPr>
-        <w:t>The local 3-pack and Local Services Ads sit above organic search. This is the single biggest near-term lever.</w:t>
+        <w:t>The local 3-pack and Local Services Ads sit above organic search. This is the single biggest near-term lever, and verification can take days — start the clock now.</w:t>
       </w:r>
     </w:p>
     <w:p>
@@ -370,7 +425,7 @@
         <w:pStyle w:val="ListNumber"/>
       </w:pPr>
       <w:r>
-        <w:t>Go to business.google.com and sign in with the Google account you'll use for the business (ideally hello@northvaleroofing.com once that exists — see Tier 1).</w:t>
+        <w:t>Go to business.google.com and sign in with a business Google account — eric@northvaleroofing.com works, or create a shared hello@ alias/group so the profile isn't tied to one person.</w:t>
       </w:r>
     </w:p>
     <w:p>
@@ -407,8 +462,8 @@
     </w:p>
     <w:tbl>
       <w:tblPr>
+        <w:tblStyle w:val="TableGrid"/>
         <w:tblW w:type="auto" w:w="0"/>
-        <w:jc w:val="center"/>
         <w:tblLook w:firstColumn="1" w:firstRow="1" w:lastColumn="0" w:lastRow="0" w:noHBand="0" w:noVBand="1" w:val="04A0"/>
       </w:tblPr>
       <w:tblGrid>
@@ -418,20 +473,21 @@
         <w:tc>
           <w:tcPr>
             <w:tcW w:type="dxa" w:w="8640"/>
-            <w:shd w:val="clear" w:fill="EEF2F8"/>
+            <w:shd w:val="clear" w:fill="FBF3E0"/>
           </w:tcPr>
           <w:p>
             <w:r>
               <w:rPr>
                 <w:b/>
+                <w:i w:val="0"/>
                 <w:color w:val="1B2A4A"/>
-                <w:sz w:val="20"/>
               </w:rPr>
               <w:t xml:space="preserve">Note:  </w:t>
             </w:r>
             <w:r>
               <w:rPr>
-                <w:sz w:val="20"/>
+                <w:b w:val="0"/>
+                <w:i w:val="0"/>
               </w:rPr>
               <w:t>You'll also need the numeric Place ID later (Tier 2, Step 7). Grab it once the profile is verified.</w:t>
             </w:r>
@@ -439,20 +495,21 @@
         </w:tc>
       </w:tr>
     </w:tbl>
-    <w:p>
-      <w:pPr>
-        <w:spacing w:after="120"/>
-      </w:pPr>
-    </w:p>
+    <w:p/>
     <w:p>
       <w:r>
         <w:rPr>
           <w:b/>
+          <w:i w:val="0"/>
           <w:color w:val="1E7A3C"/>
         </w:rPr>
         <w:t xml:space="preserve">✓ Done when:  </w:t>
       </w:r>
       <w:r>
+        <w:rPr>
+          <w:b w:val="0"/>
+          <w:i w:val="0"/>
+        </w:rPr>
         <w:t>The profile shows 'Verified' and its URL is pasted into the admin panel.</w:t>
       </w:r>
     </w:p>
@@ -461,7 +518,7 @@
         <w:pStyle w:val="Heading3"/>
       </w:pPr>
       <w:r>
-        <w:t>Step 2 — Apply for Google Local Services Ads (LSA)</w:t>
+        <w:t>Step 2 — Apply for Google Local Services Ads (LSA)   ⏳ waiting on insurance</w:t>
       </w:r>
     </w:p>
     <w:p>
@@ -475,6 +532,7 @@
       </w:r>
       <w:r>
         <w:rPr>
+          <w:b w:val="0"/>
           <w:i/>
           <w:color w:val="555555"/>
         </w:rPr>
@@ -486,7 +544,7 @@
         <w:pStyle w:val="ListNumber"/>
       </w:pPr>
       <w:r>
-        <w:t>Do this the day the LLC and general-liability insurance exist (both are required for the application).</w:t>
+        <w:t>Apply the day your general-liability insurance binds — the LLC is already registered, so insurance is the only remaining prerequisite.</w:t>
       </w:r>
     </w:p>
     <w:p>
@@ -515,8 +573,8 @@
     </w:p>
     <w:tbl>
       <w:tblPr>
+        <w:tblStyle w:val="TableGrid"/>
         <w:tblW w:type="auto" w:w="0"/>
-        <w:jc w:val="center"/>
         <w:tblLook w:firstColumn="1" w:firstRow="1" w:lastColumn="0" w:lastRow="0" w:noHBand="0" w:noVBand="1" w:val="04A0"/>
       </w:tblPr>
       <w:tblGrid>
@@ -526,41 +584,43 @@
         <w:tc>
           <w:tcPr>
             <w:tcW w:type="dxa" w:w="8640"/>
-            <w:shd w:val="clear" w:fill="EEF2F8"/>
+            <w:shd w:val="clear" w:fill="FBF3E0"/>
           </w:tcPr>
           <w:p>
             <w:r>
               <w:rPr>
                 <w:b/>
+                <w:i w:val="0"/>
                 <w:color w:val="1B2A4A"/>
-                <w:sz w:val="20"/>
               </w:rPr>
               <w:t xml:space="preserve">Prerequisite:  </w:t>
             </w:r>
             <w:r>
               <w:rPr>
-                <w:sz w:val="20"/>
+                <w:b w:val="0"/>
+                <w:i w:val="0"/>
               </w:rPr>
-              <w:t>Registered LLC (Tier 1, Step 1) + active general-liability insurance. You can't finish the application without them.</w:t>
+              <w:t>Registered LLC ✓ + active general-liability insurance (in progress). You can't finish the application without the insurance. Tip: check whether the background-check step can be started ahead of the insurance binding so it's not the long pole later.</w:t>
             </w:r>
           </w:p>
         </w:tc>
       </w:tr>
     </w:tbl>
-    <w:p>
-      <w:pPr>
-        <w:spacing w:after="120"/>
-      </w:pPr>
-    </w:p>
+    <w:p/>
     <w:p>
       <w:r>
         <w:rPr>
           <w:b/>
+          <w:i w:val="0"/>
           <w:color w:val="1E7A3C"/>
         </w:rPr>
         <w:t xml:space="preserve">✓ Done when:  </w:t>
       </w:r>
       <w:r>
+        <w:rPr>
+          <w:b w:val="0"/>
+          <w:i w:val="0"/>
+        </w:rPr>
         <w:t>The application is submitted and the background/insurance checks are in progress.</w:t>
       </w:r>
     </w:p>
@@ -569,7 +629,7 @@
         <w:pStyle w:val="Heading3"/>
       </w:pPr>
       <w:r>
-        <w:t>Step 3 — Turn on speed-to-lead in HighLevel</w:t>
+        <w:t>Step 3 — Turn on speed-to-lead in HighLevel   ▶ do today (after Tier 2, Step 1)</w:t>
       </w:r>
     </w:p>
     <w:p>
@@ -583,6 +643,7 @@
       </w:r>
       <w:r>
         <w:rPr>
+          <w:b w:val="0"/>
           <w:i/>
           <w:color w:val="555555"/>
         </w:rPr>
@@ -599,9 +660,6 @@
         <w:pStyle w:val="ListBullet"/>
       </w:pPr>
       <w:r>
-        <w:rPr>
-          <w:b/>
-        </w:rPr>
         <w:t>Workflow 1 — Instant auto-responder SMS (under 60 seconds, every form + call lead):</w:t>
       </w:r>
     </w:p>
@@ -626,9 +684,6 @@
         <w:pStyle w:val="ListBullet"/>
       </w:pPr>
       <w:r>
-        <w:rPr>
-          <w:b/>
-        </w:rPr>
         <w:t>Workflow 2 — Missed-call text-back:</w:t>
       </w:r>
     </w:p>
@@ -658,8 +713,8 @@
     </w:p>
     <w:tbl>
       <w:tblPr>
+        <w:tblStyle w:val="TableGrid"/>
         <w:tblW w:type="auto" w:w="0"/>
-        <w:jc w:val="center"/>
         <w:tblLook w:firstColumn="1" w:firstRow="1" w:lastColumn="0" w:lastRow="0" w:noHBand="0" w:noVBand="1" w:val="04A0"/>
       </w:tblPr>
       <w:tblGrid>
@@ -669,20 +724,21 @@
         <w:tc>
           <w:tcPr>
             <w:tcW w:type="dxa" w:w="8640"/>
-            <w:shd w:val="clear" w:fill="EEF2F8"/>
+            <w:shd w:val="clear" w:fill="FBF3E0"/>
           </w:tcPr>
           <w:p>
             <w:r>
               <w:rPr>
                 <w:b/>
+                <w:i w:val="0"/>
                 <w:color w:val="1B2A4A"/>
-                <w:sz w:val="20"/>
               </w:rPr>
               <w:t xml:space="preserve">TCPA:  </w:t>
             </w:r>
             <w:r>
               <w:rPr>
-                <w:sz w:val="20"/>
+                <w:b w:val="0"/>
+                <w:i w:val="0"/>
               </w:rPr>
               <w:t>The website already captures consent + timestamp + IP on every form lead, so automated SMS to a consenting lead is compliant. Keep a 'Reply STOP' opt-out in every message. Full spec: docs/runbooks/speed-to-lead.md.</w:t>
             </w:r>
@@ -690,20 +746,21 @@
         </w:tc>
       </w:tr>
     </w:tbl>
-    <w:p>
-      <w:pPr>
-        <w:spacing w:after="120"/>
-      </w:pPr>
-    </w:p>
+    <w:p/>
     <w:p>
       <w:r>
         <w:rPr>
           <w:b/>
+          <w:i w:val="0"/>
           <w:color w:val="1E7A3C"/>
         </w:rPr>
         <w:t xml:space="preserve">✓ Done when:  </w:t>
       </w:r>
       <w:r>
+        <w:rPr>
+          <w:b w:val="0"/>
+          <w:i w:val="0"/>
+        </w:rPr>
         <w:t>A test form lead triggers the auto-responder in under 60s, and a test ring-out triggers the missed-call text-back — both with a working opt-out.</w:t>
       </w:r>
     </w:p>
@@ -726,6 +783,7 @@
       </w:r>
       <w:r>
         <w:rPr>
+          <w:b w:val="0"/>
           <w:i/>
           <w:color w:val="555555"/>
         </w:rPr>
@@ -758,8 +816,8 @@
     </w:p>
     <w:tbl>
       <w:tblPr>
+        <w:tblStyle w:val="TableGrid"/>
         <w:tblW w:type="auto" w:w="0"/>
-        <w:jc w:val="center"/>
         <w:tblLook w:firstColumn="1" w:firstRow="1" w:lastColumn="0" w:lastRow="0" w:noHBand="0" w:noVBand="1" w:val="04A0"/>
       </w:tblPr>
       <w:tblGrid>
@@ -775,14 +833,15 @@
             <w:r>
               <w:rPr>
                 <w:b/>
-                <w:color w:val="9A5F0F"/>
-                <w:sz w:val="20"/>
+                <w:i w:val="0"/>
+                <w:color w:val="1B2A4A"/>
               </w:rPr>
               <w:t xml:space="preserve">Hard line:  </w:t>
             </w:r>
             <w:r>
               <w:rPr>
-                <w:sz w:val="20"/>
+                <w:b w:val="0"/>
+                <w:i w:val="0"/>
               </w:rPr>
               <w:t>Real reviews only. Never write, buy, or incentivize reviews, and ask ALL completed customers, not just the happy ones — fabricating or gating reviews violates the FTC 2024 rule and Google policy. Full SOP: docs/sops/review-request.md.</w:t>
             </w:r>
@@ -790,20 +849,21 @@
         </w:tc>
       </w:tr>
     </w:tbl>
-    <w:p>
-      <w:pPr>
-        <w:spacing w:after="120"/>
-      </w:pPr>
-    </w:p>
+    <w:p/>
     <w:p>
       <w:r>
         <w:rPr>
           <w:b/>
+          <w:i w:val="0"/>
           <w:color w:val="1E7A3C"/>
         </w:rPr>
         <w:t xml:space="preserve">✓ Done when:  </w:t>
       </w:r>
       <w:r>
+        <w:rPr>
+          <w:b w:val="0"/>
+          <w:i w:val="0"/>
+        </w:rPr>
         <w:t>The review ask is part of your job-close routine and the first genuine reviews are landing on the profile.</w:t>
       </w:r>
     </w:p>
@@ -826,6 +886,7 @@
       </w:r>
       <w:r>
         <w:rPr>
+          <w:b w:val="0"/>
           <w:i/>
           <w:color w:val="555555"/>
         </w:rPr>
@@ -837,13 +898,7 @@
         <w:pStyle w:val="ListBullet"/>
       </w:pPr>
       <w:r>
-        <w:rPr>
-          <w:b/>
-        </w:rPr>
-        <w:t xml:space="preserve">Qualification fields: </w:t>
-      </w:r>
-      <w:r>
-        <w:t>capture retail vs. insurance-claim, roof age, and timeline (emergency / weeks / just researching) so leads branch into the right nurture track.</w:t>
+        <w:t>Qualification fields: capture retail vs. insurance-claim, roof age, and timeline (emergency / weeks / just researching) so leads branch into the right nurture track.</w:t>
       </w:r>
     </w:p>
     <w:p>
@@ -851,13 +906,7 @@
         <w:pStyle w:val="ListBullet"/>
       </w:pPr>
       <w:r>
-        <w:rPr>
-          <w:b/>
-        </w:rPr>
-        <w:t xml:space="preserve">No-answer cadence: </w:t>
-      </w:r>
-      <w:r>
-        <w:t>attempt contact, then automated SMS/email nudges; after 3 no-answers, drop into a 90-day monthly nurture rather than marking the lead dead.</w:t>
+        <w:t>No-answer cadence: attempt contact, then automated SMS/email nudges; after 3 no-answers, drop into a 90-day monthly nurture rather than marking the lead dead.</w:t>
       </w:r>
     </w:p>
     <w:p>
@@ -865,30 +914,24 @@
         <w:pStyle w:val="ListBullet"/>
       </w:pPr>
       <w:r>
-        <w:rPr>
-          <w:b/>
-        </w:rPr>
-        <w:t xml:space="preserve">Quote-follow-up sequence: </w:t>
-      </w:r>
-      <w:r>
-        <w:t>after an estimate is sent, a timed sequence (day 1, 3, 7, 14) — this directly recovers the post-estimate-silence losses.</w:t>
+        <w:t>Quote-follow-up sequence: after an estimate is sent, a timed sequence (day 1, 3, 7, 14) — this directly recovers the post-estimate-silence losses.</w:t>
       </w:r>
     </w:p>
     <w:p>
       <w:r>
         <w:rPr>
           <w:b/>
+          <w:i w:val="0"/>
           <w:color w:val="1E7A3C"/>
         </w:rPr>
         <w:t xml:space="preserve">✓ Done when:  </w:t>
       </w:r>
       <w:r>
+        <w:rPr>
+          <w:b w:val="0"/>
+          <w:i w:val="0"/>
+        </w:rPr>
         <w:t>Insurance-claim leads, retail leads, and 'just researching' leads each land in a distinct nurture track, and no lead can silently die.</w:t>
-      </w:r>
-    </w:p>
-    <w:p>
-      <w:r>
-        <w:br w:type="page"/>
       </w:r>
     </w:p>
     <w:p>
@@ -901,7 +944,7 @@
     </w:p>
     <w:p>
       <w:r>
-        <w:t>These block anything going public. Two are already done (kept here so the picture is complete).</w:t>
+        <w:t>These block anything going public. Most are now done (kept here so the picture is complete).</w:t>
       </w:r>
     </w:p>
     <w:p>
@@ -909,7 +952,146 @@
         <w:pStyle w:val="Heading3"/>
       </w:pPr>
       <w:r>
-        <w:t>Step 1 — Register 'Northvale Roofing LLC'</w:t>
+        <w:t>Step 1 — Register 'Northvale Roofing LLC'   ✓ done</w:t>
+      </w:r>
+    </w:p>
+    <w:p>
+      <w:r>
+        <w:t>The LLC is registered. One follow-up: once the registered-agent / mailing address is final, hand it to the next Claude session so it can fill emailFooterAddress in the legal constants (CAN-SPAM requires a physical address in marketing email) and complete the address in the schema.</w:t>
+      </w:r>
+    </w:p>
+    <w:p>
+      <w:r>
+        <w:rPr>
+          <w:b/>
+          <w:i w:val="0"/>
+          <w:color w:val="1E7A3C"/>
+        </w:rPr>
+        <w:t xml:space="preserve">✓ Done when:  </w:t>
+      </w:r>
+      <w:r>
+        <w:rPr>
+          <w:b w:val="0"/>
+          <w:i w:val="0"/>
+        </w:rPr>
+        <w:t>The LLC is registered ✓ — remaining: hand the mailing address to Claude.</w:t>
+      </w:r>
+    </w:p>
+    <w:p>
+      <w:pPr>
+        <w:pStyle w:val="Heading3"/>
+      </w:pPr>
+      <w:r>
+        <w:t>Step 2 — Domain   ✓ done</w:t>
+      </w:r>
+    </w:p>
+    <w:p>
+      <w:r>
+        <w:t>northvaleroofing.com is registered at Squarespace Domains (2026-04-23), DNS managed there. No action needed unless DNS records change.</w:t>
+      </w:r>
+    </w:p>
+    <w:p>
+      <w:pPr>
+        <w:pStyle w:val="Heading3"/>
+      </w:pPr>
+      <w:r>
+        <w:t>Step 3 — Vercel project   ▶ one value to set today</w:t>
+      </w:r>
+    </w:p>
+    <w:p>
+      <w:r>
+        <w:t>The project exists and preview builds auto-deploy on every push. Remaining action:</w:t>
+      </w:r>
+    </w:p>
+    <w:p>
+      <w:r>
+        <w:rPr>
+          <w:rFonts w:ascii="Consolas" w:hAnsi="Consolas"/>
+          <w:b/>
+          <w:i w:val="0"/>
+          <w:color w:val="9A5F0F"/>
+          <w:sz w:val="20"/>
+        </w:rPr>
+        <w:t>PUBLIC_SITE_URL</w:t>
+      </w:r>
+      <w:r>
+        <w:rPr>
+          <w:b w:val="0"/>
+          <w:i w:val="0"/>
+          <w:sz w:val="20"/>
+        </w:rPr>
+        <w:t xml:space="preserve">  — set to https://northvaleroofing.com in Vercel env once you're ready to point at the real domain.</w:t>
+      </w:r>
+    </w:p>
+    <w:p>
+      <w:r>
+        <w:rPr>
+          <w:b/>
+          <w:i w:val="0"/>
+          <w:color w:val="1E7A3C"/>
+        </w:rPr>
+        <w:t xml:space="preserve">✓ Done when:  </w:t>
+      </w:r>
+      <w:r>
+        <w:rPr>
+          <w:b w:val="0"/>
+          <w:i w:val="0"/>
+        </w:rPr>
+        <w:t>PUBLIC_SITE_URL is set to the apex domain in Vercel.</w:t>
+      </w:r>
+    </w:p>
+    <w:p>
+      <w:pPr>
+        <w:pStyle w:val="Heading3"/>
+      </w:pPr>
+      <w:r>
+        <w:t>Step 4 — Business email   ✓ done (small follow-ups)</w:t>
+      </w:r>
+    </w:p>
+    <w:p>
+      <w:r>
+        <w:t>Google Workspace is live with eric@northvaleroofing.com and greg@northvaleroofing.com. Two quick follow-ups:</w:t>
+      </w:r>
+    </w:p>
+    <w:p>
+      <w:pPr>
+        <w:pStyle w:val="ListNumber"/>
+      </w:pPr>
+      <w:r>
+        <w:t>Add a shared hello@northvaleroofing.com alias or group for public-facing use (GBP, LSA, lead alerts) so the brand isn't tied to one person's inbox.</w:t>
+      </w:r>
+    </w:p>
+    <w:p>
+      <w:pPr>
+        <w:pStyle w:val="ListNumber"/>
+      </w:pPr>
+      <w:r>
+        <w:t>Confirm the MX + SPF, DKIM, and DMARC records validate in Squarespace's DNS manager, so marketing email lands and stays CAN-SPAM compliant. (DNS is your action — Claude will not touch it.)</w:t>
+      </w:r>
+    </w:p>
+    <w:p>
+      <w:r>
+        <w:rPr>
+          <w:b/>
+          <w:i w:val="0"/>
+          <w:color w:val="1E7A3C"/>
+        </w:rPr>
+        <w:t xml:space="preserve">✓ Done when:  </w:t>
+      </w:r>
+      <w:r>
+        <w:rPr>
+          <w:b w:val="0"/>
+          <w:i w:val="0"/>
+        </w:rPr>
+        <w:t>A shared hello@ address exists and SPF/DKIM/DMARC validate.</w:t>
+      </w:r>
+    </w:p>
+    <w:p>
+      <w:pPr>
+        <w:pStyle w:val="Heading3"/>
+      </w:pPr>
+      <w:r>
+        <w:t>Step 5 — Dedicated business phone number   (optional — a line already works)</w:t>
       </w:r>
     </w:p>
     <w:p>
@@ -923,10 +1105,16 @@
       </w:r>
       <w:r>
         <w:rPr>
+          <w:b w:val="0"/>
           <w:i/>
           <w:color w:val="555555"/>
         </w:rPr>
-        <w:t>Everything legal, the LSA application, and insurance all hang off the registered entity. It also gates the trademark filing.</w:t>
+        <w:t>A single, consistent number is the backbone of NAP consistency, GBP, and call tracking.</w:t>
+      </w:r>
+    </w:p>
+    <w:p>
+      <w:r>
+        <w:t>The real business phone (713) 449-7661 is already live in the site data and satisfies the NAP index gate. This step is only about a tracked/dedicated line if you choose a separate one.</w:t>
       </w:r>
     </w:p>
     <w:p>
@@ -934,35 +1122,37 @@
         <w:pStyle w:val="ListNumber"/>
       </w:pPr>
       <w:r>
-        <w:t>File with the Texas Secretary of State (roughly $300, 3–5 business days).</w:t>
-      </w:r>
-    </w:p>
-    <w:p>
-      <w:pPr>
-        <w:pStyle w:val="ListNumber"/>
-      </w:pPr>
-      <w:r>
-        <w:t>We recommend LLC-first — see docs/trademark-clearance.md for the reasoning.</w:t>
-      </w:r>
-    </w:p>
-    <w:p>
-      <w:pPr>
-        <w:pStyle w:val="ListNumber"/>
-      </w:pPr>
-      <w:r>
-        <w:t>Once the registered-agent address is final, hand it to the next Claude session so it can fill emailFooterAddress in the legal constants (CAN-SPAM requires a physical address in marketing email).</w:t>
+        <w:t>If you provision a dedicated number (Twilio or Google Voice Business), hand it to the next Claude session to update BRAND.phoneE164 + phoneDisplay in src/lib/brand.ts — never hardcode it elsewhere.</w:t>
       </w:r>
     </w:p>
     <w:p>
       <w:r>
         <w:rPr>
           <w:b/>
+          <w:i w:val="0"/>
           <w:color w:val="1E7A3C"/>
         </w:rPr>
         <w:t xml:space="preserve">✓ Done when:  </w:t>
       </w:r>
       <w:r>
-        <w:t>The LLC is registered and you have the entity name + address on file.</w:t>
+        <w:rPr>
+          <w:b w:val="0"/>
+          <w:i w:val="0"/>
+        </w:rPr>
+        <w:t>The number is chosen and reflected in brand.ts everywhere the site shows a phone.</w:t>
+      </w:r>
+    </w:p>
+    <w:p>
+      <w:pPr>
+        <w:pStyle w:val="Heading1"/>
+      </w:pPr>
+      <w:r>
+        <w:t>Tier 2 — Analytics + CRM wiring</w:t>
+      </w:r>
+    </w:p>
+    <w:p>
+      <w:r>
+        <w:t>These unlock attribution and ROI reporting. Every one is env-gated: paste the key into Vercel and the feature turns on — no key means a clean skip, nothing breaks. All of Tier 2 is actionable today.</w:t>
       </w:r>
     </w:p>
     <w:p>
@@ -970,65 +1160,7 @@
         <w:pStyle w:val="Heading3"/>
       </w:pPr>
       <w:r>
-        <w:t>Step 2 — Domain (already done ✓)</w:t>
-      </w:r>
-    </w:p>
-    <w:p>
-      <w:r>
-        <w:t>northvaleroofing.com is registered at Squarespace Domains (2026-04-23), DNS managed there. No action needed unless DNS records change.</w:t>
-      </w:r>
-    </w:p>
-    <w:p>
-      <w:pPr>
-        <w:pStyle w:val="Heading3"/>
-      </w:pPr>
-      <w:r>
-        <w:t>Step 3 — Vercel project (created ✓ — one value still to set)</w:t>
-      </w:r>
-    </w:p>
-    <w:p>
-      <w:r>
-        <w:t xml:space="preserve">The project exists and preview builds auto-deploy on every push. Remaining action: </w:t>
-      </w:r>
-    </w:p>
-    <w:p>
-      <w:pPr>
-        <w:ind w:left="360"/>
-      </w:pPr>
-      <w:r>
-        <w:rPr>
-          <w:rFonts w:ascii="Consolas" w:hAnsi="Consolas"/>
-          <w:b/>
-          <w:color w:val="9A5F0F"/>
-          <w:sz w:val="20"/>
-        </w:rPr>
-        <w:t>PUBLIC_SITE_URL</w:t>
-      </w:r>
-      <w:r>
-        <w:rPr>
-          <w:sz w:val="20"/>
-        </w:rPr>
-        <w:t xml:space="preserve">  — set to https://northvaleroofing.com in Vercel env once you're ready to point at the real domain.</w:t>
-      </w:r>
-    </w:p>
-    <w:p>
-      <w:r>
-        <w:rPr>
-          <w:b/>
-          <w:color w:val="1E7A3C"/>
-        </w:rPr>
-        <w:t xml:space="preserve">✓ Done when:  </w:t>
-      </w:r>
-      <w:r>
-        <w:t>PUBLIC_SITE_URL is set to the apex domain in Vercel.</w:t>
-      </w:r>
-    </w:p>
-    <w:p>
-      <w:pPr>
-        <w:pStyle w:val="Heading3"/>
-      </w:pPr>
-      <w:r>
-        <w:t>Step 4 — Set up business email</w:t>
+        <w:t>Step 0 — Day-one lead alerts + never-lose-a-lead storage   ▶ do today (quick win)</w:t>
       </w:r>
     </w:p>
     <w:p>
@@ -1042,169 +1174,7 @@
       </w:r>
       <w:r>
         <w:rPr>
-          <w:i/>
-          <w:color w:val="555555"/>
-        </w:rPr>
-        <w:t>You need hello@northvaleroofing.com for GBP, LSA, lead alerts, and general trust. Deliverability depends on the DNS auth records.</w:t>
-      </w:r>
-    </w:p>
-    <w:p>
-      <w:pPr>
-        <w:pStyle w:val="ListNumber"/>
-      </w:pPr>
-      <w:r>
-        <w:t>Set up Google Workspace (or at minimum a hello@northvaleroofing.com mailbox).</w:t>
-      </w:r>
-    </w:p>
-    <w:p>
-      <w:pPr>
-        <w:pStyle w:val="ListNumber"/>
-      </w:pPr>
-      <w:r>
-        <w:t>Add the MX records, plus SPF, DKIM, and DMARC records, in Squarespace's DNS manager. (DNS is your action — Claude will not touch it.)</w:t>
-      </w:r>
-    </w:p>
-    <w:p>
-      <w:r>
-        <w:rPr>
-          <w:b/>
-          <w:color w:val="1E7A3C"/>
-        </w:rPr>
-        <w:t xml:space="preserve">✓ Done when:  </w:t>
-      </w:r>
-      <w:r>
-        <w:t>hello@northvaleroofing.com sends and receives, and SPF/DKIM/DMARC validate.</w:t>
-      </w:r>
-    </w:p>
-    <w:p>
-      <w:pPr>
-        <w:pStyle w:val="Heading3"/>
-      </w:pPr>
-      <w:r>
-        <w:t>Step 5 — Create a dedicated business phone number</w:t>
-      </w:r>
-    </w:p>
-    <w:p>
-      <w:r>
-        <w:rPr>
-          <w:b/>
-          <w:i/>
-          <w:color w:val="555555"/>
-        </w:rPr>
-        <w:t xml:space="preserve">Why it matters.  </w:t>
-      </w:r>
-      <w:r>
-        <w:rPr>
-          <w:i/>
-          <w:color w:val="555555"/>
-        </w:rPr>
-        <w:t>A single, consistent number is the backbone of NAP consistency, GBP, and call tracking.</w:t>
-      </w:r>
-    </w:p>
-    <w:p>
-      <w:pPr>
-        <w:pStyle w:val="ListNumber"/>
-      </w:pPr>
-      <w:r>
-        <w:t>Provision a dedicated number (Twilio or Google Voice Business).</w:t>
-      </w:r>
-    </w:p>
-    <w:p>
-      <w:pPr>
-        <w:pStyle w:val="ListNumber"/>
-      </w:pPr>
-      <w:r>
-        <w:t>Hand the number to the next Claude session to update BRAND.phoneE164 + phoneDisplay in src/lib/brand.ts — never hardcode it elsewhere.</w:t>
-      </w:r>
-    </w:p>
-    <w:tbl>
-      <w:tblPr>
-        <w:tblW w:type="auto" w:w="0"/>
-        <w:jc w:val="center"/>
-        <w:tblLook w:firstColumn="1" w:firstRow="1" w:lastColumn="0" w:lastRow="0" w:noHBand="0" w:noVBand="1" w:val="04A0"/>
-      </w:tblPr>
-      <w:tblGrid>
-        <w:gridCol w:w="8640"/>
-      </w:tblGrid>
-      <w:tr>
-        <w:tc>
-          <w:tcPr>
-            <w:tcW w:type="dxa" w:w="8640"/>
-            <w:shd w:val="clear" w:fill="EEF2F8"/>
-          </w:tcPr>
-          <w:p>
-            <w:r>
-              <w:rPr>
-                <w:b/>
-                <w:color w:val="1B2A4A"/>
-                <w:sz w:val="20"/>
-              </w:rPr>
-              <w:t xml:space="preserve">Note:  </w:t>
-            </w:r>
-            <w:r>
-              <w:rPr>
-                <w:sz w:val="20"/>
-              </w:rPr>
-              <w:t>The real business phone (713) 449-7661 is already live in the site data and satisfies the NAP index gate. This step is about the tracked/dedicated line if you choose a separate one.</w:t>
-            </w:r>
-          </w:p>
-        </w:tc>
-      </w:tr>
-    </w:tbl>
-    <w:p>
-      <w:pPr>
-        <w:spacing w:after="120"/>
-      </w:pPr>
-    </w:p>
-    <w:p>
-      <w:r>
-        <w:rPr>
-          <w:b/>
-          <w:color w:val="1E7A3C"/>
-        </w:rPr>
-        <w:t xml:space="preserve">✓ Done when:  </w:t>
-      </w:r>
-      <w:r>
-        <w:t>The number is chosen and reflected in brand.ts everywhere the site shows a phone.</w:t>
-      </w:r>
-    </w:p>
-    <w:p>
-      <w:r>
-        <w:br w:type="page"/>
-      </w:r>
-    </w:p>
-    <w:p>
-      <w:pPr>
-        <w:pStyle w:val="Heading1"/>
-      </w:pPr>
-      <w:r>
-        <w:t>Tier 2 — Analytics + CRM wiring</w:t>
-      </w:r>
-    </w:p>
-    <w:p>
-      <w:r>
-        <w:t>These unlock attribution and ROI reporting. Every one is env-gated: paste the key into Vercel and the feature turns on — no key means a clean skip, nothing breaks.</w:t>
-      </w:r>
-    </w:p>
-    <w:p>
-      <w:pPr>
-        <w:pStyle w:val="Heading3"/>
-      </w:pPr>
-      <w:r>
-        <w:t>Step 0 — Day-one lead alerts + never-lose-a-lead storage (quick win)</w:t>
-      </w:r>
-    </w:p>
-    <w:p>
-      <w:r>
-        <w:rPr>
-          <w:b/>
-          <w:i/>
-          <w:color w:val="555555"/>
-        </w:rPr>
-        <w:t xml:space="preserve">Why it matters.  </w:t>
-      </w:r>
-      <w:r>
-        <w:rPr>
+          <w:b w:val="0"/>
           <w:i/>
           <w:color w:val="555555"/>
         </w:rPr>
@@ -1215,18 +1185,17 @@
       <w:r>
         <w:rPr>
           <w:b/>
+          <w:i w:val="0"/>
         </w:rPr>
-        <w:t xml:space="preserve">Text alerts (Twilio, ~$1/mo + ~1¢/text): </w:t>
+        <w:t>Text alerts (Twilio, ~$1/mo + ~1¢/text):</w:t>
       </w:r>
     </w:p>
     <w:p>
-      <w:pPr>
-        <w:ind w:left="360"/>
-      </w:pPr>
       <w:r>
         <w:rPr>
           <w:rFonts w:ascii="Consolas" w:hAnsi="Consolas"/>
           <w:b/>
+          <w:i w:val="0"/>
           <w:color w:val="9A5F0F"/>
           <w:sz w:val="20"/>
         </w:rPr>
@@ -1234,19 +1203,19 @@
       </w:r>
       <w:r>
         <w:rPr>
+          <w:b w:val="0"/>
+          <w:i w:val="0"/>
           <w:sz w:val="20"/>
         </w:rPr>
         <w:t xml:space="preserve">  — Account SID (starts AC…)</w:t>
       </w:r>
     </w:p>
     <w:p>
-      <w:pPr>
-        <w:ind w:left="360"/>
-      </w:pPr>
       <w:r>
         <w:rPr>
           <w:rFonts w:ascii="Consolas" w:hAnsi="Consolas"/>
           <w:b/>
+          <w:i w:val="0"/>
           <w:color w:val="9A5F0F"/>
           <w:sz w:val="20"/>
         </w:rPr>
@@ -1254,19 +1223,19 @@
       </w:r>
       <w:r>
         <w:rPr>
+          <w:b w:val="0"/>
+          <w:i w:val="0"/>
           <w:sz w:val="20"/>
         </w:rPr>
         <w:t xml:space="preserve">  — Auth Token</w:t>
       </w:r>
     </w:p>
     <w:p>
-      <w:pPr>
-        <w:ind w:left="360"/>
-      </w:pPr>
       <w:r>
         <w:rPr>
           <w:rFonts w:ascii="Consolas" w:hAnsi="Consolas"/>
           <w:b/>
+          <w:i w:val="0"/>
           <w:color w:val="9A5F0F"/>
           <w:sz w:val="20"/>
         </w:rPr>
@@ -1274,19 +1243,19 @@
       </w:r>
       <w:r>
         <w:rPr>
+          <w:b w:val="0"/>
+          <w:i w:val="0"/>
           <w:sz w:val="20"/>
         </w:rPr>
         <w:t xml:space="preserve">  — the Twilio number you buy, in +1… format</w:t>
       </w:r>
     </w:p>
     <w:p>
-      <w:pPr>
-        <w:ind w:left="360"/>
-      </w:pPr>
       <w:r>
         <w:rPr>
           <w:rFonts w:ascii="Consolas" w:hAnsi="Consolas"/>
           <w:b/>
+          <w:i w:val="0"/>
           <w:color w:val="9A5F0F"/>
           <w:sz w:val="20"/>
         </w:rPr>
@@ -1294,6 +1263,8 @@
       </w:r>
       <w:r>
         <w:rPr>
+          <w:b w:val="0"/>
+          <w:i w:val="0"/>
           <w:sz w:val="20"/>
         </w:rPr>
         <w:t xml:space="preserve">  — owner cell(s), comma-separated E.164, e.g. +12815550111,+18325550222</w:t>
@@ -1303,18 +1274,17 @@
       <w:r>
         <w:rPr>
           <w:b/>
+          <w:i w:val="0"/>
         </w:rPr>
-        <w:t xml:space="preserve">Email alerts (Resend, free to start): </w:t>
+        <w:t>Email alerts (Resend, free to start):</w:t>
       </w:r>
     </w:p>
     <w:p>
-      <w:pPr>
-        <w:ind w:left="360"/>
-      </w:pPr>
       <w:r>
         <w:rPr>
           <w:rFonts w:ascii="Consolas" w:hAnsi="Consolas"/>
           <w:b/>
+          <w:i w:val="0"/>
           <w:color w:val="9A5F0F"/>
           <w:sz w:val="20"/>
         </w:rPr>
@@ -1322,19 +1292,19 @@
       </w:r>
       <w:r>
         <w:rPr>
+          <w:b w:val="0"/>
+          <w:i w:val="0"/>
           <w:sz w:val="20"/>
         </w:rPr>
         <w:t xml:space="preserve">  — the key (starts re_…)</w:t>
       </w:r>
     </w:p>
     <w:p>
-      <w:pPr>
-        <w:ind w:left="360"/>
-      </w:pPr>
       <w:r>
         <w:rPr>
           <w:rFonts w:ascii="Consolas" w:hAnsi="Consolas"/>
           <w:b/>
+          <w:i w:val="0"/>
           <w:color w:val="9A5F0F"/>
           <w:sz w:val="20"/>
         </w:rPr>
@@ -1342,19 +1312,19 @@
       </w:r>
       <w:r>
         <w:rPr>
+          <w:b w:val="0"/>
+          <w:i w:val="0"/>
           <w:sz w:val="20"/>
         </w:rPr>
-        <w:t xml:space="preserve">  — owner email(s), comma-separated</w:t>
+        <w:t xml:space="preserve">  — owner email(s), comma-separated — e.g. eric@ + greg@northvaleroofing.com</w:t>
       </w:r>
     </w:p>
     <w:p>
-      <w:pPr>
-        <w:ind w:left="360"/>
-      </w:pPr>
       <w:r>
         <w:rPr>
           <w:rFonts w:ascii="Consolas" w:hAnsi="Consolas"/>
           <w:b/>
+          <w:i w:val="0"/>
           <w:color w:val="9A5F0F"/>
           <w:sz w:val="20"/>
         </w:rPr>
@@ -1362,6 +1332,8 @@
       </w:r>
       <w:r>
         <w:rPr>
+          <w:b w:val="0"/>
+          <w:i w:val="0"/>
           <w:sz w:val="20"/>
         </w:rPr>
         <w:t xml:space="preserve">  — leads@resend.dev to start, or a verified domain sender</w:t>
@@ -1371,8 +1343,9 @@
       <w:r>
         <w:rPr>
           <w:b/>
+          <w:i w:val="0"/>
         </w:rPr>
-        <w:t xml:space="preserve">Never-lose-a-lead storage (Vercel Blob, ~2 min): </w:t>
+        <w:t>Never-lose-a-lead storage (Vercel Blob, ~2 min):</w:t>
       </w:r>
     </w:p>
     <w:p>
@@ -1393,8 +1366,8 @@
     </w:p>
     <w:tbl>
       <w:tblPr>
+        <w:tblStyle w:val="TableGrid"/>
         <w:tblW w:type="auto" w:w="0"/>
-        <w:jc w:val="center"/>
         <w:tblLook w:firstColumn="1" w:firstRow="1" w:lastColumn="0" w:lastRow="0" w:noHBand="0" w:noVBand="1" w:val="04A0"/>
       </w:tblPr>
       <w:tblGrid>
@@ -1404,20 +1377,21 @@
         <w:tc>
           <w:tcPr>
             <w:tcW w:type="dxa" w:w="8640"/>
-            <w:shd w:val="clear" w:fill="EEF2F8"/>
+            <w:shd w:val="clear" w:fill="FBF3E0"/>
           </w:tcPr>
           <w:p>
             <w:r>
               <w:rPr>
                 <w:b/>
+                <w:i w:val="0"/>
                 <w:color w:val="1B2A4A"/>
-                <w:sz w:val="20"/>
               </w:rPr>
               <w:t xml:space="preserve">Note:  </w:t>
             </w:r>
             <w:r>
               <w:rPr>
-                <w:sz w:val="20"/>
+                <w:b w:val="0"/>
+                <w:i w:val="0"/>
               </w:rPr>
               <w:t>Full walkthrough: docs/setup-leads.md. Each channel turns on independently when its keys are present.</w:t>
             </w:r>
@@ -1425,20 +1399,21 @@
         </w:tc>
       </w:tr>
     </w:tbl>
-    <w:p>
-      <w:pPr>
-        <w:spacing w:after="120"/>
-      </w:pPr>
-    </w:p>
+    <w:p/>
     <w:p>
       <w:r>
         <w:rPr>
           <w:b/>
+          <w:i w:val="0"/>
           <w:color w:val="1E7A3C"/>
         </w:rPr>
         <w:t xml:space="preserve">✓ Done when:  </w:t>
       </w:r>
       <w:r>
+        <w:rPr>
+          <w:b w:val="0"/>
+          <w:i w:val="0"/>
+        </w:rPr>
         <w:t>A test form submission texts and emails you within seconds, and a JSON record appears in the Blob store.</w:t>
       </w:r>
     </w:p>
@@ -1447,7 +1422,7 @@
         <w:pStyle w:val="Heading3"/>
       </w:pPr>
       <w:r>
-        <w:t>Step 1 — HighLevel CRM keys (powers Tier 0 speed-to-lead)</w:t>
+        <w:t>Step 1 — HighLevel CRM keys   ▶ do today (powers Tier 0 speed-to-lead)</w:t>
       </w:r>
     </w:p>
     <w:p>
@@ -1461,6 +1436,7 @@
       </w:r>
       <w:r>
         <w:rPr>
+          <w:b w:val="0"/>
           <w:i/>
           <w:color w:val="555555"/>
         </w:rPr>
@@ -1508,13 +1484,11 @@
       </w:r>
     </w:p>
     <w:p>
-      <w:pPr>
-        <w:ind w:left="360"/>
-      </w:pPr>
       <w:r>
         <w:rPr>
           <w:rFonts w:ascii="Consolas" w:hAnsi="Consolas"/>
           <w:b/>
+          <w:i w:val="0"/>
           <w:color w:val="9A5F0F"/>
           <w:sz w:val="20"/>
         </w:rPr>
@@ -1522,19 +1496,19 @@
       </w:r>
       <w:r>
         <w:rPr>
+          <w:b w:val="0"/>
+          <w:i w:val="0"/>
           <w:sz w:val="20"/>
         </w:rPr>
         <w:t xml:space="preserve">  — the Private Integration token (required)</w:t>
       </w:r>
     </w:p>
     <w:p>
-      <w:pPr>
-        <w:ind w:left="360"/>
-      </w:pPr>
       <w:r>
         <w:rPr>
           <w:rFonts w:ascii="Consolas" w:hAnsi="Consolas"/>
           <w:b/>
+          <w:i w:val="0"/>
           <w:color w:val="9A5F0F"/>
           <w:sz w:val="20"/>
         </w:rPr>
@@ -1542,19 +1516,19 @@
       </w:r>
       <w:r>
         <w:rPr>
+          <w:b w:val="0"/>
+          <w:i w:val="0"/>
           <w:sz w:val="20"/>
         </w:rPr>
         <w:t xml:space="preserve">  — the sub-account/location id (required)</w:t>
       </w:r>
     </w:p>
     <w:p>
-      <w:pPr>
-        <w:ind w:left="360"/>
-      </w:pPr>
       <w:r>
         <w:rPr>
           <w:rFonts w:ascii="Consolas" w:hAnsi="Consolas"/>
           <w:b/>
+          <w:i w:val="0"/>
           <w:color w:val="9A5F0F"/>
           <w:sz w:val="20"/>
         </w:rPr>
@@ -1562,19 +1536,19 @@
       </w:r>
       <w:r>
         <w:rPr>
+          <w:b w:val="0"/>
+          <w:i w:val="0"/>
           <w:sz w:val="20"/>
         </w:rPr>
         <w:t xml:space="preserve">  — optional — set with the stage below to also open a pipeline deal per lead</w:t>
       </w:r>
     </w:p>
     <w:p>
-      <w:pPr>
-        <w:ind w:left="360"/>
-      </w:pPr>
       <w:r>
         <w:rPr>
           <w:rFonts w:ascii="Consolas" w:hAnsi="Consolas"/>
           <w:b/>
+          <w:i w:val="0"/>
           <w:color w:val="9A5F0F"/>
           <w:sz w:val="20"/>
         </w:rPr>
@@ -1582,6 +1556,8 @@
       </w:r>
       <w:r>
         <w:rPr>
+          <w:b w:val="0"/>
+          <w:i w:val="0"/>
           <w:sz w:val="20"/>
         </w:rPr>
         <w:t xml:space="preserve">  — optional — the first / 'New Lead' stage id</w:t>
@@ -1589,8 +1565,8 @@
     </w:p>
     <w:tbl>
       <w:tblPr>
+        <w:tblStyle w:val="TableGrid"/>
         <w:tblW w:type="auto" w:w="0"/>
-        <w:jc w:val="center"/>
         <w:tblLook w:firstColumn="1" w:firstRow="1" w:lastColumn="0" w:lastRow="0" w:noHBand="0" w:noVBand="1" w:val="04A0"/>
       </w:tblPr>
       <w:tblGrid>
@@ -1600,41 +1576,43 @@
         <w:tc>
           <w:tcPr>
             <w:tcW w:type="dxa" w:w="8640"/>
-            <w:shd w:val="clear" w:fill="EEF2F8"/>
+            <w:shd w:val="clear" w:fill="FBF3E0"/>
           </w:tcPr>
           <w:p>
             <w:r>
               <w:rPr>
                 <w:b/>
+                <w:i w:val="0"/>
                 <w:color w:val="1B2A4A"/>
-                <w:sz w:val="20"/>
               </w:rPr>
               <w:t xml:space="preserve">Note:  </w:t>
             </w:r>
             <w:r>
               <w:rPr>
-                <w:sz w:val="20"/>
+                <w:b w:val="0"/>
+                <w:i w:val="0"/>
               </w:rPr>
-              <w:t>First two keys = contacts created. Add the last two = each lead also opens an opportunity. Full guide: docs/setup-highlevel.md.</w:t>
+              <w:t>First two keys = contacts created. Add the last two = each lead also opens an opportunity. Full guide: docs/setup-highlevel.md. After keys land, submit one test lead and confirm the live v2 payload shapes match — they were built to the published docs.</w:t>
             </w:r>
           </w:p>
         </w:tc>
       </w:tr>
     </w:tbl>
-    <w:p>
-      <w:pPr>
-        <w:spacing w:after="120"/>
-      </w:pPr>
-    </w:p>
+    <w:p/>
     <w:p>
       <w:r>
         <w:rPr>
           <w:b/>
+          <w:i w:val="0"/>
           <w:color w:val="1E7A3C"/>
         </w:rPr>
         <w:t xml:space="preserve">✓ Done when:  </w:t>
       </w:r>
       <w:r>
+        <w:rPr>
+          <w:b w:val="0"/>
+          <w:i w:val="0"/>
+        </w:rPr>
         <w:t>A test form submission shows a new contact (and, if configured, a New-Lead opportunity) in HighLevel within seconds, with lead_source populated.</w:t>
       </w:r>
     </w:p>
@@ -1657,6 +1635,7 @@
       </w:r>
       <w:r>
         <w:rPr>
+          <w:b w:val="0"/>
           <w:i/>
           <w:color w:val="555555"/>
         </w:rPr>
@@ -1688,13 +1667,11 @@
       </w:r>
     </w:p>
     <w:p>
-      <w:pPr>
-        <w:ind w:left="360"/>
-      </w:pPr>
       <w:r>
         <w:rPr>
           <w:rFonts w:ascii="Consolas" w:hAnsi="Consolas"/>
           <w:b/>
+          <w:i w:val="0"/>
           <w:color w:val="9A5F0F"/>
           <w:sz w:val="20"/>
         </w:rPr>
@@ -1702,19 +1679,19 @@
       </w:r>
       <w:r>
         <w:rPr>
+          <w:b w:val="0"/>
+          <w:i w:val="0"/>
           <w:sz w:val="20"/>
         </w:rPr>
         <w:t xml:space="preserve">  — the shared secret for webhook signature verification</w:t>
       </w:r>
     </w:p>
     <w:p>
-      <w:pPr>
-        <w:ind w:left="360"/>
-      </w:pPr>
       <w:r>
         <w:rPr>
           <w:rFonts w:ascii="Consolas" w:hAnsi="Consolas"/>
           <w:b/>
+          <w:i w:val="0"/>
           <w:color w:val="9A5F0F"/>
           <w:sz w:val="20"/>
         </w:rPr>
@@ -1722,19 +1699,19 @@
       </w:r>
       <w:r>
         <w:rPr>
+          <w:b w:val="0"/>
+          <w:i w:val="0"/>
           <w:sz w:val="20"/>
         </w:rPr>
         <w:t xml:space="preserve">  — CallRail API v3 key</w:t>
       </w:r>
     </w:p>
     <w:p>
-      <w:pPr>
-        <w:ind w:left="360"/>
-      </w:pPr>
       <w:r>
         <w:rPr>
           <w:rFonts w:ascii="Consolas" w:hAnsi="Consolas"/>
           <w:b/>
+          <w:i w:val="0"/>
           <w:color w:val="9A5F0F"/>
           <w:sz w:val="20"/>
         </w:rPr>
@@ -1742,19 +1719,19 @@
       </w:r>
       <w:r>
         <w:rPr>
+          <w:b w:val="0"/>
+          <w:i w:val="0"/>
           <w:sz w:val="20"/>
         </w:rPr>
         <w:t xml:space="preserve">  — your CallRail account id</w:t>
       </w:r>
     </w:p>
     <w:p>
-      <w:pPr>
-        <w:ind w:left="360"/>
-      </w:pPr>
       <w:r>
         <w:rPr>
           <w:rFonts w:ascii="Consolas" w:hAnsi="Consolas"/>
           <w:b/>
+          <w:i w:val="0"/>
           <w:color w:val="9A5F0F"/>
           <w:sz w:val="20"/>
         </w:rPr>
@@ -1762,6 +1739,8 @@
       </w:r>
       <w:r>
         <w:rPr>
+          <w:b w:val="0"/>
+          <w:i w:val="0"/>
           <w:sz w:val="20"/>
         </w:rPr>
         <w:t xml:space="preserve">  — the companyId/scriptKey segments from the DNI swap.js snippet</w:t>
@@ -1771,11 +1750,16 @@
       <w:r>
         <w:rPr>
           <w:b/>
+          <w:i w:val="0"/>
           <w:color w:val="1E7A3C"/>
         </w:rPr>
         <w:t xml:space="preserve">✓ Done when:  </w:t>
       </w:r>
       <w:r>
+        <w:rPr>
+          <w:b w:val="0"/>
+          <w:i w:val="0"/>
+        </w:rPr>
         <w:t>A completed test call to a tracked number appears as a HighLevel contact and fires the same SMS/email alert as a form lead.</w:t>
       </w:r>
     </w:p>
@@ -1784,7 +1768,7 @@
         <w:pStyle w:val="Heading3"/>
       </w:pPr>
       <w:r>
-        <w:t>Step 3 — Google Analytics 4 (GA4)</w:t>
+        <w:t>Step 3 — Google Analytics 4 (GA4)   ▶ do today</w:t>
       </w:r>
     </w:p>
     <w:p>
@@ -1798,6 +1782,7 @@
       </w:r>
       <w:r>
         <w:rPr>
+          <w:b w:val="0"/>
           <w:i/>
           <w:color w:val="555555"/>
         </w:rPr>
@@ -1821,13 +1806,11 @@
       </w:r>
     </w:p>
     <w:p>
-      <w:pPr>
-        <w:ind w:left="360"/>
-      </w:pPr>
       <w:r>
         <w:rPr>
           <w:rFonts w:ascii="Consolas" w:hAnsi="Consolas"/>
           <w:b/>
+          <w:i w:val="0"/>
           <w:color w:val="9A5F0F"/>
           <w:sz w:val="20"/>
         </w:rPr>
@@ -1835,6 +1818,8 @@
       </w:r>
       <w:r>
         <w:rPr>
+          <w:b w:val="0"/>
+          <w:i w:val="0"/>
           <w:sz w:val="20"/>
         </w:rPr>
         <w:t xml:space="preserve">  — the G-XXXXXXXXXX measurement id</w:t>
@@ -1842,8 +1827,8 @@
     </w:p>
     <w:tbl>
       <w:tblPr>
+        <w:tblStyle w:val="TableGrid"/>
         <w:tblW w:type="auto" w:w="0"/>
-        <w:jc w:val="center"/>
         <w:tblLook w:firstColumn="1" w:firstRow="1" w:lastColumn="0" w:lastRow="0" w:noHBand="0" w:noVBand="1" w:val="04A0"/>
       </w:tblPr>
       <w:tblGrid>
@@ -1853,20 +1838,21 @@
         <w:tc>
           <w:tcPr>
             <w:tcW w:type="dxa" w:w="8640"/>
-            <w:shd w:val="clear" w:fill="EEF2F8"/>
+            <w:shd w:val="clear" w:fill="FBF3E0"/>
           </w:tcPr>
           <w:p>
             <w:r>
               <w:rPr>
                 <w:b/>
+                <w:i w:val="0"/>
                 <w:color w:val="1B2A4A"/>
-                <w:sz w:val="20"/>
               </w:rPr>
-              <w:t xml:space="preserve">Bonus (2 min, no DNS):   </w:t>
+              <w:t xml:space="preserve">Bonus (2 min, no DNS):  </w:t>
             </w:r>
             <w:r>
               <w:rPr>
-                <w:sz w:val="20"/>
+                <w:b w:val="0"/>
+                <w:i w:val="0"/>
               </w:rPr>
               <w:t>Verify Google Search Console via the HTML-tag method — set PUBLIC_GSC_VERIFICATION to the content value Google shows, redeploy, click Verify, then submit https://northvaleroofing.com/sitemap-index.xml. See docs/analytics-search-console.md.</w:t>
             </w:r>
@@ -1874,20 +1860,21 @@
         </w:tc>
       </w:tr>
     </w:tbl>
-    <w:p>
-      <w:pPr>
-        <w:spacing w:after="120"/>
-      </w:pPr>
-    </w:p>
+    <w:p/>
     <w:p>
       <w:r>
         <w:rPr>
           <w:b/>
+          <w:i w:val="0"/>
           <w:color w:val="1E7A3C"/>
         </w:rPr>
         <w:t xml:space="preserve">✓ Done when:  </w:t>
       </w:r>
       <w:r>
+        <w:rPr>
+          <w:b w:val="0"/>
+          <w:i w:val="0"/>
+        </w:rPr>
         <w:t>GA4 Realtime shows your own visit to the live site.</w:t>
       </w:r>
     </w:p>
@@ -1910,6 +1897,7 @@
       </w:r>
       <w:r>
         <w:rPr>
+          <w:b w:val="0"/>
           <w:i/>
           <w:color w:val="555555"/>
         </w:rPr>
@@ -1933,13 +1921,11 @@
       </w:r>
     </w:p>
     <w:p>
-      <w:pPr>
-        <w:ind w:left="360"/>
-      </w:pPr>
       <w:r>
         <w:rPr>
           <w:rFonts w:ascii="Consolas" w:hAnsi="Consolas"/>
           <w:b/>
+          <w:i w:val="0"/>
           <w:color w:val="9A5F0F"/>
           <w:sz w:val="20"/>
         </w:rPr>
@@ -1947,6 +1933,8 @@
       </w:r>
       <w:r>
         <w:rPr>
+          <w:b w:val="0"/>
+          <w:i w:val="0"/>
           <w:sz w:val="20"/>
         </w:rPr>
         <w:t xml:space="preserve">  — the GTM-XXXXXXX container id</w:t>
@@ -1956,11 +1944,16 @@
       <w:r>
         <w:rPr>
           <w:b/>
+          <w:i w:val="0"/>
           <w:color w:val="1E7A3C"/>
         </w:rPr>
         <w:t xml:space="preserve">✓ Done when:  </w:t>
       </w:r>
       <w:r>
+        <w:rPr>
+          <w:b w:val="0"/>
+          <w:i w:val="0"/>
+        </w:rPr>
         <w:t>The GTM container is live and PUBLIC_GTM_ID is set.</w:t>
       </w:r>
     </w:p>
@@ -1969,7 +1962,7 @@
         <w:pStyle w:val="Heading3"/>
       </w:pPr>
       <w:r>
-        <w:t>Step 5 — Meta Business Manager + Conversions API (CAPI)</w:t>
+        <w:t>Step 5 — Meta Business Manager + Conversions API (CAPI)   ▶ do today (you have access)</w:t>
       </w:r>
     </w:p>
     <w:p>
@@ -1983,10 +1976,11 @@
       </w:r>
       <w:r>
         <w:rPr>
+          <w:b w:val="0"/>
           <w:i/>
           <w:color w:val="555555"/>
         </w:rPr>
-        <w:t>Every form lead sends a server-side 'Lead' conversion (hashed PII) to Meta automatically — the code is done and waiting on keys.</w:t>
+        <w:t>Every form lead sends a server-side 'Lead' conversion (hashed PII) to Meta automatically — the code is done and waiting on keys. You now have the Meta account, so this is actionable today.</w:t>
       </w:r>
     </w:p>
     <w:p>
@@ -1994,7 +1988,7 @@
         <w:pStyle w:val="ListNumber"/>
       </w:pPr>
       <w:r>
-        <w:t>Create a Meta ad account and Business Manager.</w:t>
+        <w:t>In your Meta Business account, confirm/create the ad account, then open Events Manager → Data Sources and create a Pixel if one doesn't exist.</w:t>
       </w:r>
     </w:p>
     <w:p>
@@ -2002,7 +1996,7 @@
         <w:pStyle w:val="ListNumber"/>
       </w:pPr>
       <w:r>
-        <w:t>Issue a CAPI access token and note the pixel id.</w:t>
+        <w:t>Copy the numeric Pixel ID, then generate a Conversions API access token (Events Manager → your pixel → Settings → Generate access token).</w:t>
       </w:r>
     </w:p>
     <w:p>
@@ -2014,13 +2008,11 @@
       </w:r>
     </w:p>
     <w:p>
-      <w:pPr>
-        <w:ind w:left="360"/>
-      </w:pPr>
       <w:r>
         <w:rPr>
           <w:rFonts w:ascii="Consolas" w:hAnsi="Consolas"/>
           <w:b/>
+          <w:i w:val="0"/>
           <w:color w:val="9A5F0F"/>
           <w:sz w:val="20"/>
         </w:rPr>
@@ -2028,19 +2020,19 @@
       </w:r>
       <w:r>
         <w:rPr>
+          <w:b w:val="0"/>
+          <w:i w:val="0"/>
           <w:sz w:val="20"/>
         </w:rPr>
         <w:t xml:space="preserve">  — the Conversions API access token (server-side)</w:t>
       </w:r>
     </w:p>
     <w:p>
-      <w:pPr>
-        <w:ind w:left="360"/>
-      </w:pPr>
       <w:r>
         <w:rPr>
           <w:rFonts w:ascii="Consolas" w:hAnsi="Consolas"/>
           <w:b/>
+          <w:i w:val="0"/>
           <w:color w:val="9A5F0F"/>
           <w:sz w:val="20"/>
         </w:rPr>
@@ -2048,20 +2040,63 @@
       </w:r>
       <w:r>
         <w:rPr>
+          <w:b w:val="0"/>
+          <w:i w:val="0"/>
           <w:sz w:val="20"/>
         </w:rPr>
         <w:t xml:space="preserve">  — the pixel id (digits) — also renders the browser pixel</w:t>
       </w:r>
     </w:p>
+    <w:tbl>
+      <w:tblPr>
+        <w:tblStyle w:val="TableGrid"/>
+        <w:tblW w:type="auto" w:w="0"/>
+        <w:tblLook w:firstColumn="1" w:firstRow="1" w:lastColumn="0" w:lastRow="0" w:noHBand="0" w:noVBand="1" w:val="04A0"/>
+      </w:tblPr>
+      <w:tblGrid>
+        <w:gridCol w:w="8640"/>
+      </w:tblGrid>
+      <w:tr>
+        <w:tc>
+          <w:tcPr>
+            <w:tcW w:type="dxa" w:w="8640"/>
+            <w:shd w:val="clear" w:fill="FBF3E0"/>
+          </w:tcPr>
+          <w:p>
+            <w:r>
+              <w:rPr>
+                <w:b/>
+                <w:i w:val="0"/>
+                <w:color w:val="1B2A4A"/>
+              </w:rPr>
+              <w:t xml:space="preserve">Note:  </w:t>
+            </w:r>
+            <w:r>
+              <w:rPr>
+                <w:b w:val="0"/>
+                <w:i w:val="0"/>
+              </w:rPr>
+              <w:t>Hold actual campaigns paused until the CPL signal is real (that's Tier 5). This step is just the account + pixel + token wiring.</w:t>
+            </w:r>
+          </w:p>
+        </w:tc>
+      </w:tr>
+    </w:tbl>
+    <w:p/>
     <w:p>
       <w:r>
         <w:rPr>
           <w:b/>
+          <w:i w:val="0"/>
           <w:color w:val="1E7A3C"/>
         </w:rPr>
         <w:t xml:space="preserve">✓ Done when:  </w:t>
       </w:r>
       <w:r>
+        <w:rPr>
+          <w:b w:val="0"/>
+          <w:i w:val="0"/>
+        </w:rPr>
         <w:t>A test form lead shows a server-side Lead event in Meta Events Manager.</w:t>
       </w:r>
     </w:p>
@@ -2084,6 +2119,7 @@
       </w:r>
       <w:r>
         <w:rPr>
+          <w:b w:val="0"/>
           <w:i/>
           <w:color w:val="555555"/>
         </w:rPr>
@@ -2107,13 +2143,11 @@
       </w:r>
     </w:p>
     <w:p>
-      <w:pPr>
-        <w:ind w:left="360"/>
-      </w:pPr>
       <w:r>
         <w:rPr>
           <w:rFonts w:ascii="Consolas" w:hAnsi="Consolas"/>
           <w:b/>
+          <w:i w:val="0"/>
           <w:color w:val="9A5F0F"/>
           <w:sz w:val="20"/>
         </w:rPr>
@@ -2121,19 +2155,19 @@
       </w:r>
       <w:r>
         <w:rPr>
+          <w:b w:val="0"/>
+          <w:i w:val="0"/>
           <w:sz w:val="20"/>
         </w:rPr>
         <w:t xml:space="preserve">  — AW-XXXXXXXXX</w:t>
       </w:r>
     </w:p>
     <w:p>
-      <w:pPr>
-        <w:ind w:left="360"/>
-      </w:pPr>
       <w:r>
         <w:rPr>
           <w:rFonts w:ascii="Consolas" w:hAnsi="Consolas"/>
           <w:b/>
+          <w:i w:val="0"/>
           <w:color w:val="9A5F0F"/>
           <w:sz w:val="20"/>
         </w:rPr>
@@ -2141,59 +2175,27 @@
       </w:r>
       <w:r>
         <w:rPr>
+          <w:b w:val="0"/>
+          <w:i w:val="0"/>
           <w:sz w:val="20"/>
         </w:rPr>
         <w:t xml:space="preserve">  — the label after the slash — /thank-you fires the conversion only when both are set</w:t>
       </w:r>
     </w:p>
-    <w:tbl>
-      <w:tblPr>
-        <w:tblW w:type="auto" w:w="0"/>
-        <w:jc w:val="center"/>
-        <w:tblLook w:firstColumn="1" w:firstRow="1" w:lastColumn="0" w:lastRow="0" w:noHBand="0" w:noVBand="1" w:val="04A0"/>
-      </w:tblPr>
-      <w:tblGrid>
-        <w:gridCol w:w="8640"/>
-      </w:tblGrid>
-      <w:tr>
-        <w:tc>
-          <w:tcPr>
-            <w:tcW w:type="dxa" w:w="8640"/>
-            <w:shd w:val="clear" w:fill="EEF2F8"/>
-          </w:tcPr>
-          <w:p>
-            <w:r>
-              <w:rPr>
-                <w:b/>
-                <w:color w:val="1B2A4A"/>
-                <w:sz w:val="20"/>
-              </w:rPr>
-              <w:t xml:space="preserve">Note:  </w:t>
-            </w:r>
-            <w:r>
-              <w:rPr>
-                <w:sz w:val="20"/>
-              </w:rPr>
-              <w:t>Hold actual campaigns paused until the CPL signal is real (that's Tier 5). This step is just the account + wiring.</w:t>
-            </w:r>
-          </w:p>
-        </w:tc>
-      </w:tr>
-    </w:tbl>
-    <w:p>
-      <w:pPr>
-        <w:spacing w:after="120"/>
-      </w:pPr>
-    </w:p>
     <w:p>
       <w:r>
         <w:rPr>
           <w:b/>
+          <w:i w:val="0"/>
           <w:color w:val="1E7A3C"/>
         </w:rPr>
         <w:t xml:space="preserve">✓ Done when:  </w:t>
       </w:r>
       <w:r>
+        <w:rPr>
+          <w:b w:val="0"/>
+          <w:i w:val="0"/>
+        </w:rPr>
         <w:t>The account exists and the conversion id/label are set in Vercel.</w:t>
       </w:r>
     </w:p>
@@ -2216,6 +2218,7 @@
       </w:r>
       <w:r>
         <w:rPr>
+          <w:b w:val="0"/>
           <w:i/>
           <w:color w:val="555555"/>
         </w:rPr>
@@ -2239,13 +2242,11 @@
       </w:r>
     </w:p>
     <w:p>
-      <w:pPr>
-        <w:ind w:left="360"/>
-      </w:pPr>
       <w:r>
         <w:rPr>
           <w:rFonts w:ascii="Consolas" w:hAnsi="Consolas"/>
           <w:b/>
+          <w:i w:val="0"/>
           <w:color w:val="9A5F0F"/>
           <w:sz w:val="20"/>
         </w:rPr>
@@ -2253,6 +2254,8 @@
       </w:r>
       <w:r>
         <w:rPr>
+          <w:b w:val="0"/>
+          <w:i w:val="0"/>
           <w:sz w:val="20"/>
         </w:rPr>
         <w:t xml:space="preserve">  — the Northvale Roofing GBP Place ID</w:t>
@@ -2262,11 +2265,16 @@
       <w:r>
         <w:rPr>
           <w:b/>
+          <w:i w:val="0"/>
           <w:color w:val="1E7A3C"/>
         </w:rPr>
         <w:t xml:space="preserve">✓ Done when:  </w:t>
       </w:r>
       <w:r>
+        <w:rPr>
+          <w:b w:val="0"/>
+          <w:i w:val="0"/>
+        </w:rPr>
         <w:t>GOOGLE_PLACE_ID is set in Vercel.</w:t>
       </w:r>
     </w:p>
@@ -2289,6 +2297,7 @@
       </w:r>
       <w:r>
         <w:rPr>
+          <w:b w:val="0"/>
           <w:i/>
           <w:color w:val="555555"/>
         </w:rPr>
@@ -2312,13 +2321,11 @@
       </w:r>
     </w:p>
     <w:p>
-      <w:pPr>
-        <w:ind w:left="360"/>
-      </w:pPr>
       <w:r>
         <w:rPr>
           <w:rFonts w:ascii="Consolas" w:hAnsi="Consolas"/>
           <w:b/>
+          <w:i w:val="0"/>
           <w:color w:val="9A5F0F"/>
           <w:sz w:val="20"/>
         </w:rPr>
@@ -2326,6 +2333,8 @@
       </w:r>
       <w:r>
         <w:rPr>
+          <w:b w:val="0"/>
+          <w:i w:val="0"/>
           <w:sz w:val="20"/>
         </w:rPr>
         <w:t xml:space="preserve">  — scoped for the reviews pull</w:t>
@@ -2335,17 +2344,17 @@
       <w:r>
         <w:rPr>
           <w:b/>
+          <w:i w:val="0"/>
           <w:color w:val="1E7A3C"/>
         </w:rPr>
         <w:t xml:space="preserve">✓ Done when:  </w:t>
       </w:r>
       <w:r>
+        <w:rPr>
+          <w:b w:val="0"/>
+          <w:i w:val="0"/>
+        </w:rPr>
         <w:t>GOOGLE_PLACES_API_KEY is set and /reviews pulls real GBP reviews.</w:t>
-      </w:r>
-    </w:p>
-    <w:p>
-      <w:r>
-        <w:br w:type="page"/>
       </w:r>
     </w:p>
     <w:p>
@@ -2361,13 +2370,7 @@
         <w:pStyle w:val="ListBullet"/>
       </w:pPr>
       <w:r>
-        <w:rPr>
-          <w:b/>
-        </w:rPr>
-        <w:t xml:space="preserve">Keys → Vercel. </w:t>
-      </w:r>
-      <w:r>
-        <w:t>Anything that's a KEY goes into Vercel env (Production + Preview). The feature activates on redeploy. Nothing else needed.</w:t>
+        <w:t>Keys → Vercel. Anything that's a KEY goes into Vercel env (Production + Preview). The feature activates on redeploy. Nothing else needed.</w:t>
       </w:r>
     </w:p>
     <w:p>
@@ -2375,13 +2378,7 @@
         <w:pStyle w:val="ListBullet"/>
       </w:pPr>
       <w:r>
-        <w:rPr>
-          <w:b/>
-        </w:rPr>
-        <w:t xml:space="preserve">Data → admin panel. </w:t>
-      </w:r>
-      <w:r>
-        <w:t>GBP/social URLs, financing terms, team, warranty, and photos go into the /keystatic admin panel — those pages publish themselves once real data is present.</w:t>
+        <w:t>Data → admin panel. GBP/social URLs, financing terms, team, warranty, and photos go into the /keystatic admin panel — those pages publish themselves once real data is present.</w:t>
       </w:r>
     </w:p>
     <w:p>
@@ -2389,13 +2386,7 @@
         <w:pStyle w:val="ListBullet"/>
       </w:pPr>
       <w:r>
-        <w:rPr>
-          <w:b/>
-        </w:rPr>
-        <w:t xml:space="preserve">Facts/decisions → next Claude session. </w:t>
-      </w:r>
-      <w:r>
-        <w:t>Years in market, carriers you've worked, crew model, the LLC's mailing address, and the new phone number — hand these to the next Claude session so it can update the code truthfully. Never invent any of them.</w:t>
+        <w:t>Facts/decisions → next Claude session. The LLC's mailing address, years in market, carriers you've worked, crew model, and any new phone number — hand these to the next Claude session so it can update the code truthfully. Never invent any of them.</w:t>
       </w:r>
     </w:p>
     <w:p>
@@ -2408,33 +2399,16 @@
     </w:p>
     <w:p>
       <w:r>
-        <w:t xml:space="preserve">Once these are live and leads are flowing with attribution, the plan continues into Tier 2.5/2.6 (data that unlocks gated SEO pages + the copy-facts questionnaire), Tier 3 (legal review + real photography, removing demo images), and Tier 5 (paid campaigns + the launch checklist). The full ordered list lives in </w:t>
-      </w:r>
-      <w:r>
-        <w:rPr>
-          <w:rFonts w:ascii="Consolas" w:hAnsi="Consolas"/>
-        </w:rPr>
-        <w:t>TASKS_FOR_ERIC.md</w:t>
-      </w:r>
-      <w:r>
-        <w:t xml:space="preserve"> in the repo. Ask for the next installment of this document when you're ready.</w:t>
+        <w:t>Once these are live and leads are flowing with attribution, the plan continues into Tier 2.5/2.6 (data that unlocks gated SEO pages + the copy-facts questionnaire), Tier 3 (legal review + real photography, removing demo images), and Tier 5 (paid campaigns + the launch checklist). The full ordered list lives in TASKS_FOR_ERIC.md in the repo. Ask for the next installment of this document when you're ready.</w:t>
       </w:r>
     </w:p>
     <w:p>
-      <w:pPr>
-        <w:pBdr>
-          <w:bottom w:val="single" w:sz="6" w:space="1" w:color="C9A227"/>
-        </w:pBdr>
-      </w:pPr>
-    </w:p>
-    <w:p>
-      <w:pPr>
-        <w:jc w:val="center"/>
-      </w:pPr>
       <w:r>
         <w:rPr>
+          <w:b w:val="0"/>
+          <w:i w:val="0"/>
           <w:color w:val="555555"/>
-          <w:sz w:val="18"/>
+          <w:sz w:val="20"/>
         </w:rPr>
         <w:t>Northvale Roofing · Internal execution plan · Not for public distribution</w:t>
       </w:r>
@@ -2812,9 +2786,6 @@
     <w:name w:val="Normal"/>
     <w:qFormat/>
     <w:rsid w:val="00FC693F"/>
-    <w:pPr>
-      <w:spacing w:after="120"/>
-    </w:pPr>
     <w:rPr>
       <w:rFonts w:ascii="Calibri" w:hAnsi="Calibri"/>
       <w:sz w:val="22"/>

</xml_diff>